<commit_message>
feat: Week 11 REINFORCE/AC/PPO + QL_vs_DQN大Grid对比 + 清理临时文件
Week 11 — 连续动作 RL 完整链路：
- week11_continuous_env.py: EMS 简化连续动作环境 + DQN失效演示
- week11_reinforce.py: REINFORCE 策略梯度
- week11_actor_critic.py: Actor-Critic
- week11_ppo.py: PPO (clipped surrogate objective)
- week11_compare.py: 三种方法对比实验

Week 10 补充：
- compare_large_grid.py: 4x4 vs 8x8 QL/DQN对比
- QL_vs_DQN_大Grid对比报告.docx 实验报告
- dqn_explained.py: DQN 逐行拆解教学版

清理：
- 删除 demo_qlearning_gridworld.py (被 week10_qlearning 替代)
- 删除 week10_dqn_sac_concepts.py (纯概念，已有doc)
- 清理 workspace 临时文件和已删除的旧 doc
</commit_message>
<xml_diff>
--- a/docs/notes/DQN_SAC_深度学习原理解析.docx
+++ b/docs/notes/DQN_SAC_深度学习原理解析.docx
@@ -86,7 +86,7 @@
           <w:sz w:val="20"/>
           <w:lang w:eastAsia="zh-CN"/>
         </w:rPr>
-        <w:t>生成日期：2026-07-27</w:t>
+        <w:t>生成日期：2026-07-28</w:t>
       </w:r>
     </w:p>
     <w:p>
@@ -618,6 +618,14 @@
           <w:lang w:eastAsia="zh-CN"/>
         </w:rPr>
       </w:pPr>
+    </w:p>
+    <w:p>
+      <w:pPr>
+        <w:rPr>
+          <w:rFonts w:hint="eastAsia"/>
+          <w:lang w:eastAsia="zh-CN"/>
+        </w:rPr>
+      </w:pPr>
       <w:r>
         <w:rPr>
           <w:lang w:eastAsia="zh-CN"/>
@@ -636,16 +644,9 @@
       </w:pPr>
       <w:r>
         <w:rPr>
-          <w:highlight w:val="yellow"/>
-          <w:lang w:eastAsia="zh-CN"/>
-        </w:rPr>
-        <w:t>探索-利用困境：是选已知的好动作，还是试新动作</w:t>
-      </w:r>
-      <w:r>
-        <w:rPr>
-          <w:lang w:eastAsia="zh-CN"/>
-        </w:rPr>
-        <w:t>？</w:t>
+          <w:lang w:eastAsia="zh-CN"/>
+        </w:rPr>
+        <w:t>探索-利用困境：是选已知的好动作，还是试新动作？</w:t>
       </w:r>
     </w:p>
     <w:p>
@@ -1185,7 +1186,21 @@
         <w:rPr>
           <w:lang w:eastAsia="zh-CN"/>
         </w:rPr>
-        <w:t>alpha (学习率)：每次更新迈多大步。太大震荡，太小收敛慢。</w:t>
+        <w:t>alpha (学习率)：每次</w:t>
+      </w:r>
+      <w:proofErr w:type="gramStart"/>
+      <w:r>
+        <w:rPr>
+          <w:lang w:eastAsia="zh-CN"/>
+        </w:rPr>
+        <w:t>更新迈多大步</w:t>
+      </w:r>
+      <w:proofErr w:type="gramEnd"/>
+      <w:r>
+        <w:rPr>
+          <w:lang w:eastAsia="zh-CN"/>
+        </w:rPr>
+        <w:t>。太大震荡，太小收敛慢。</w:t>
       </w:r>
     </w:p>
     <w:p>
@@ -1205,7 +1220,15 @@
       </w:r>
       <w:proofErr w:type="spellEnd"/>
       <w:r>
-        <w:t>' Q(s', a')：这是"实际观察到的奖励 + 对未来最优价值的估计"，比当前 Q(s,a) 更接近真实值，所以把它当目标</w:t>
+        <w:t xml:space="preserve">' </w:t>
+      </w:r>
+      <w:proofErr w:type="gramStart"/>
+      <w:r>
+        <w:t>Q(</w:t>
+      </w:r>
+      <w:proofErr w:type="gramEnd"/>
+      <w:r>
+        <w:t>s', a')：这是"实际观察到的奖励 + 对未来最优价值的估计"，比当前 Q(s,a) 更接近真实值，所以把它当目标</w:t>
       </w:r>
     </w:p>
     <w:p>
@@ -1320,10 +1343,12 @@
         <w:t>DQN 把 Q(</w:t>
       </w:r>
       <w:proofErr w:type="spellStart"/>
+      <w:proofErr w:type="gramStart"/>
       <w:r>
         <w:t>s,a</w:t>
       </w:r>
       <w:proofErr w:type="spellEnd"/>
+      <w:proofErr w:type="gramEnd"/>
       <w:r>
         <w:t xml:space="preserve">) </w:t>
       </w:r>
@@ -2180,6 +2205,14 @@
       <w:pPr>
         <w:rPr>
           <w:rFonts w:hint="eastAsia"/>
+          <w:lang w:eastAsia="zh-CN"/>
+        </w:rPr>
+      </w:pPr>
+    </w:p>
+    <w:p>
+      <w:pPr>
+        <w:rPr>
+          <w:rFonts w:hint="eastAsia"/>
         </w:rPr>
       </w:pPr>
       <w:proofErr w:type="spellStart"/>
@@ -2772,6 +2805,7 @@
               <w:rPr>
                 <w:sz w:val="20"/>
               </w:rPr>
+              <w:lastRenderedPageBreak/>
               <w:t>作用</w:t>
             </w:r>
           </w:p>
@@ -2854,7 +2888,6 @@
               <w:rPr>
                 <w:sz w:val="20"/>
               </w:rPr>
-              <w:lastRenderedPageBreak/>
               <w:t>更新频率</w:t>
             </w:r>
           </w:p>
@@ -4161,18 +4194,20 @@
       <w:pPr>
         <w:rPr>
           <w:rFonts w:hint="eastAsia"/>
-        </w:rPr>
-      </w:pPr>
-      <w:r>
-        <w:t>DQN 的网络结构取决于输入类型：</w:t>
-      </w:r>
-    </w:p>
-    <w:p>
-      <w:pPr>
-        <w:rPr>
-          <w:rFonts w:hint="eastAsia"/>
-        </w:rPr>
-      </w:pPr>
+          <w:lang w:eastAsia="zh-CN"/>
+        </w:rPr>
+      </w:pPr>
+      <w:r>
+        <w:t xml:space="preserve">DQN </w:t>
+      </w:r>
+      <w:proofErr w:type="spellStart"/>
+      <w:r>
+        <w:t>的网络结构取决于输入类型</w:t>
+      </w:r>
+      <w:proofErr w:type="spellEnd"/>
+      <w:r>
+        <w:t>：</w:t>
+      </w:r>
     </w:p>
     <w:p>
       <w:pPr>
@@ -4516,6 +4551,7 @@
         <w:ind w:left="567"/>
         <w:rPr>
           <w:rFonts w:hint="eastAsia"/>
+          <w:lang w:eastAsia="zh-CN"/>
         </w:rPr>
       </w:pPr>
       <w:r>
@@ -4558,6 +4594,7 @@
         </w:rPr>
         <w:t xml:space="preserve"> 4-18 </w:t>
       </w:r>
+      <w:proofErr w:type="spellStart"/>
       <w:r>
         <w:rPr>
           <w:rFonts w:ascii="Consolas" w:hAnsi="Consolas"/>
@@ -4566,23 +4603,19 @@
         </w:rPr>
         <w:t>个离散动作</w:t>
       </w:r>
-    </w:p>
-    <w:p>
-      <w:pPr>
-        <w:rPr>
-          <w:rFonts w:hint="eastAsia"/>
-        </w:rPr>
-      </w:pPr>
-    </w:p>
-    <w:p>
-      <w:pPr>
-        <w:rPr>
-          <w:rFonts w:hint="eastAsia"/>
+      <w:proofErr w:type="spellEnd"/>
+    </w:p>
+    <w:p>
+      <w:pPr>
+        <w:rPr>
+          <w:rFonts w:hint="eastAsia"/>
+          <w:lang w:eastAsia="zh-CN"/>
         </w:rPr>
       </w:pPr>
       <w:r>
         <w:rPr>
           <w:b/>
+          <w:lang w:eastAsia="zh-CN"/>
         </w:rPr>
         <w:t>情况二：向量输入（如 EMS 状态）</w:t>
       </w:r>
@@ -4595,21 +4628,95 @@
           <w:rFonts w:hint="eastAsia"/>
         </w:rPr>
       </w:pPr>
-      <w:r>
-        <w:rPr>
-          <w:rFonts w:ascii="Consolas" w:hAnsi="Consolas"/>
-          <w:color w:val="333333"/>
-          <w:sz w:val="19"/>
-        </w:rPr>
-        <w:t>输入：</w:t>
-      </w:r>
-      <w:r>
-        <w:rPr>
-          <w:rFonts w:ascii="Consolas" w:hAnsi="Consolas"/>
-          <w:color w:val="333333"/>
-          <w:sz w:val="19"/>
-        </w:rPr>
-        <w:t>[SOC, P_load, V_bat, T_fc, ...] -&gt; shape = [n_features]</w:t>
+      <w:proofErr w:type="spellStart"/>
+      <w:r>
+        <w:rPr>
+          <w:rFonts w:ascii="Consolas" w:hAnsi="Consolas"/>
+          <w:color w:val="333333"/>
+          <w:sz w:val="19"/>
+        </w:rPr>
+        <w:t>输入</w:t>
+      </w:r>
+      <w:proofErr w:type="spellEnd"/>
+      <w:proofErr w:type="gramStart"/>
+      <w:r>
+        <w:rPr>
+          <w:rFonts w:ascii="Consolas" w:hAnsi="Consolas"/>
+          <w:color w:val="333333"/>
+          <w:sz w:val="19"/>
+        </w:rPr>
+        <w:t>：</w:t>
+      </w:r>
+      <w:r>
+        <w:rPr>
+          <w:rFonts w:ascii="Consolas" w:hAnsi="Consolas"/>
+          <w:color w:val="333333"/>
+          <w:sz w:val="19"/>
+        </w:rPr>
+        <w:t>[</w:t>
+      </w:r>
+      <w:proofErr w:type="gramEnd"/>
+      <w:r>
+        <w:rPr>
+          <w:rFonts w:ascii="Consolas" w:hAnsi="Consolas"/>
+          <w:color w:val="333333"/>
+          <w:sz w:val="19"/>
+        </w:rPr>
+        <w:t xml:space="preserve">SOC, </w:t>
+      </w:r>
+      <w:proofErr w:type="spellStart"/>
+      <w:r>
+        <w:rPr>
+          <w:rFonts w:ascii="Consolas" w:hAnsi="Consolas"/>
+          <w:color w:val="333333"/>
+          <w:sz w:val="19"/>
+        </w:rPr>
+        <w:t>P_load</w:t>
+      </w:r>
+      <w:proofErr w:type="spellEnd"/>
+      <w:r>
+        <w:rPr>
+          <w:rFonts w:ascii="Consolas" w:hAnsi="Consolas"/>
+          <w:color w:val="333333"/>
+          <w:sz w:val="19"/>
+        </w:rPr>
+        <w:t xml:space="preserve">, </w:t>
+      </w:r>
+      <w:proofErr w:type="spellStart"/>
+      <w:r>
+        <w:rPr>
+          <w:rFonts w:ascii="Consolas" w:hAnsi="Consolas"/>
+          <w:color w:val="333333"/>
+          <w:sz w:val="19"/>
+        </w:rPr>
+        <w:t>V_bat</w:t>
+      </w:r>
+      <w:proofErr w:type="spellEnd"/>
+      <w:r>
+        <w:rPr>
+          <w:rFonts w:ascii="Consolas" w:hAnsi="Consolas"/>
+          <w:color w:val="333333"/>
+          <w:sz w:val="19"/>
+        </w:rPr>
+        <w:t xml:space="preserve">, </w:t>
+      </w:r>
+      <w:proofErr w:type="spellStart"/>
+      <w:r>
+        <w:rPr>
+          <w:rFonts w:ascii="Consolas" w:hAnsi="Consolas"/>
+          <w:color w:val="333333"/>
+          <w:sz w:val="19"/>
+        </w:rPr>
+        <w:t>T_fc</w:t>
+      </w:r>
+      <w:proofErr w:type="spellEnd"/>
+      <w:r>
+        <w:rPr>
+          <w:rFonts w:ascii="Consolas" w:hAnsi="Consolas"/>
+          <w:color w:val="333333"/>
+          <w:sz w:val="19"/>
+        </w:rPr>
+        <w:t>, ...] -&gt; shape = [n_features]</w:t>
       </w:r>
     </w:p>
     <w:p>
@@ -4685,6 +4792,7 @@
         <w:ind w:left="567"/>
         <w:rPr>
           <w:rFonts w:hint="eastAsia"/>
+          <w:lang w:eastAsia="zh-CN"/>
         </w:rPr>
       </w:pPr>
       <w:r>
@@ -4719,13 +4827,6 @@
         </w:rPr>
         <w:t xml:space="preserve"> -&gt; shape = [n_actions]</w:t>
       </w:r>
-    </w:p>
-    <w:p>
-      <w:pPr>
-        <w:rPr>
-          <w:rFonts w:hint="eastAsia"/>
-        </w:rPr>
-      </w:pPr>
     </w:p>
     <w:p>
       <w:pPr>
@@ -4745,20 +4846,6 @@
     </w:p>
     <w:p>
       <w:pPr>
-        <w:rPr>
-          <w:rFonts w:hint="eastAsia"/>
-          <w:lang w:eastAsia="zh-CN"/>
-        </w:rPr>
-      </w:pPr>
-      <w:r>
-        <w:rPr>
-          <w:lang w:eastAsia="zh-CN"/>
-        </w:rPr>
-        <w:br w:type="page"/>
-      </w:r>
-    </w:p>
-    <w:p>
-      <w:pPr>
         <w:pStyle w:val="21"/>
         <w:rPr>
           <w:lang w:eastAsia="zh-CN"/>
@@ -4769,7 +4856,6 @@
           <w:color w:val="1F3A5F"/>
           <w:lang w:eastAsia="zh-CN"/>
         </w:rPr>
-        <w:lastRenderedPageBreak/>
         <w:t xml:space="preserve">1.5 DQN </w:t>
       </w:r>
       <w:r>
@@ -4856,18 +4942,33 @@
       <w:pPr>
         <w:rPr>
           <w:rFonts w:hint="eastAsia"/>
-        </w:rPr>
-      </w:pPr>
-      <w:r>
-        <w:t>Q_theta(s', a') 本身有估计误差，max 会取到被高估的动作 -&gt; Q 值越算越高</w:t>
-      </w:r>
-    </w:p>
-    <w:p>
-      <w:pPr>
-        <w:rPr>
-          <w:rFonts w:hint="eastAsia"/>
-        </w:rPr>
-      </w:pPr>
+          <w:lang w:eastAsia="zh-CN"/>
+        </w:rPr>
+      </w:pPr>
+      <w:r>
+        <w:t>Q_</w:t>
+      </w:r>
+      <w:proofErr w:type="gramStart"/>
+      <w:r>
+        <w:t>theta(</w:t>
+      </w:r>
+      <w:proofErr w:type="gramEnd"/>
+      <w:r>
+        <w:t xml:space="preserve">s', a') 本身有估计误差，max </w:t>
+      </w:r>
+      <w:proofErr w:type="spellStart"/>
+      <w:r>
+        <w:t>会取到被高估的动作</w:t>
+      </w:r>
+      <w:proofErr w:type="spellEnd"/>
+      <w:r>
+        <w:t xml:space="preserve"> -&gt; Q </w:t>
+      </w:r>
+      <w:proofErr w:type="spellStart"/>
+      <w:r>
+        <w:t>值越算越高</w:t>
+      </w:r>
+      <w:proofErr w:type="spellEnd"/>
     </w:p>
     <w:p>
       <w:pPr>
@@ -4960,6 +5061,7 @@
           <w:color w:val="333333"/>
           <w:sz w:val="19"/>
         </w:rPr>
+        <w:lastRenderedPageBreak/>
         <w:t xml:space="preserve">              </w:t>
       </w:r>
       <w:r>
@@ -5488,33 +5590,17 @@
         <w:rPr>
           <w:lang w:eastAsia="zh-CN"/>
         </w:rPr>
-        <w:lastRenderedPageBreak/>
         <w:t>同时保留一定的随机采样，避免过拟合到少数极端经验</w:t>
       </w:r>
     </w:p>
     <w:p>
       <w:pPr>
-        <w:rPr>
-          <w:rFonts w:hint="eastAsia"/>
-          <w:lang w:eastAsia="zh-CN"/>
-        </w:rPr>
-      </w:pPr>
-      <w:r>
-        <w:rPr>
-          <w:lang w:eastAsia="zh-CN"/>
-        </w:rPr>
-        <w:br w:type="page"/>
-      </w:r>
-    </w:p>
-    <w:p>
-      <w:pPr>
         <w:pStyle w:val="21"/>
       </w:pPr>
       <w:r>
         <w:rPr>
           <w:color w:val="1F3A5F"/>
         </w:rPr>
-        <w:lastRenderedPageBreak/>
         <w:t xml:space="preserve">1.6 DQN </w:t>
       </w:r>
       <w:proofErr w:type="spellStart"/>
@@ -5770,7 +5856,15 @@
                 <w:sz w:val="20"/>
                 <w:lang w:eastAsia="zh-CN"/>
               </w:rPr>
-              <w:t>max 操作放大估计误差</w:t>
+              <w:t>max 操作放大估计误</w:t>
+            </w:r>
+            <w:r>
+              <w:rPr>
+                <w:sz w:val="20"/>
+                <w:lang w:eastAsia="zh-CN"/>
+              </w:rPr>
+              <w:lastRenderedPageBreak/>
+              <w:t>差</w:t>
             </w:r>
           </w:p>
         </w:tc>
@@ -5789,6 +5883,7 @@
               <w:rPr>
                 <w:sz w:val="20"/>
               </w:rPr>
+              <w:lastRenderedPageBreak/>
               <w:t>策略次优</w:t>
             </w:r>
             <w:proofErr w:type="spellEnd"/>
@@ -5797,6 +5892,12 @@
                 <w:sz w:val="20"/>
               </w:rPr>
               <w:br/>
+            </w:r>
+            <w:r>
+              <w:rPr>
+                <w:sz w:val="20"/>
+              </w:rPr>
+              <w:lastRenderedPageBreak/>
               <w:t xml:space="preserve">Q </w:t>
             </w:r>
             <w:proofErr w:type="spellStart"/>
@@ -5823,6 +5924,7 @@
               <w:rPr>
                 <w:sz w:val="20"/>
               </w:rPr>
+              <w:lastRenderedPageBreak/>
               <w:t>-&gt; Double DQN</w:t>
             </w:r>
           </w:p>
@@ -5940,6 +6042,7 @@
       <w:pPr>
         <w:rPr>
           <w:rFonts w:hint="eastAsia"/>
+          <w:lang w:eastAsia="zh-CN"/>
         </w:rPr>
       </w:pPr>
     </w:p>
@@ -5960,20 +6063,6 @@
     </w:p>
     <w:p>
       <w:pPr>
-        <w:rPr>
-          <w:rFonts w:hint="eastAsia"/>
-          <w:lang w:eastAsia="zh-CN"/>
-        </w:rPr>
-      </w:pPr>
-      <w:r>
-        <w:rPr>
-          <w:lang w:eastAsia="zh-CN"/>
-        </w:rPr>
-        <w:br w:type="page"/>
-      </w:r>
-    </w:p>
-    <w:p>
-      <w:pPr>
         <w:pStyle w:val="1"/>
       </w:pPr>
       <w:proofErr w:type="spellStart"/>
@@ -5981,7 +6070,6 @@
         <w:rPr>
           <w:color w:val="1F3A5F"/>
         </w:rPr>
-        <w:lastRenderedPageBreak/>
         <w:t>第二部分：</w:t>
       </w:r>
       <w:r>
@@ -6044,18 +6132,28 @@
       <w:pPr>
         <w:rPr>
           <w:rFonts w:hint="eastAsia"/>
-        </w:rPr>
-      </w:pPr>
-      <w:r>
-        <w:t>DQN 的"先算 Q 值再 argmax"范式有两个根本问题：</w:t>
-      </w:r>
-    </w:p>
-    <w:p>
-      <w:pPr>
-        <w:rPr>
-          <w:rFonts w:hint="eastAsia"/>
-        </w:rPr>
-      </w:pPr>
+          <w:lang w:eastAsia="zh-CN"/>
+        </w:rPr>
+      </w:pPr>
+      <w:r>
+        <w:t xml:space="preserve">DQN 的"先算 Q </w:t>
+      </w:r>
+      <w:proofErr w:type="spellStart"/>
+      <w:r>
+        <w:t>值再</w:t>
+      </w:r>
+      <w:proofErr w:type="spellEnd"/>
+      <w:r>
+        <w:t xml:space="preserve"> </w:t>
+      </w:r>
+      <w:proofErr w:type="spellStart"/>
+      <w:r>
+        <w:t>argmax"范式有两个根本问题</w:t>
+      </w:r>
+      <w:proofErr w:type="spellEnd"/>
+      <w:r>
+        <w:t>：</w:t>
+      </w:r>
     </w:p>
     <w:p>
       <w:pPr>
@@ -6121,14 +6219,6 @@
       <w:pPr>
         <w:rPr>
           <w:rFonts w:hint="eastAsia"/>
-          <w:lang w:eastAsia="zh-CN"/>
-        </w:rPr>
-      </w:pPr>
-    </w:p>
-    <w:p>
-      <w:pPr>
-        <w:rPr>
-          <w:rFonts w:hint="eastAsia"/>
         </w:rPr>
       </w:pPr>
       <w:r>
@@ -6214,27 +6304,12 @@
     </w:p>
     <w:p>
       <w:pPr>
-        <w:rPr>
-          <w:rFonts w:hint="eastAsia"/>
-          <w:lang w:eastAsia="zh-CN"/>
-        </w:rPr>
-      </w:pPr>
-      <w:r>
-        <w:rPr>
-          <w:lang w:eastAsia="zh-CN"/>
-        </w:rPr>
-        <w:br w:type="page"/>
-      </w:r>
-    </w:p>
-    <w:p>
-      <w:pPr>
         <w:pStyle w:val="21"/>
       </w:pPr>
       <w:r>
         <w:rPr>
           <w:color w:val="1F3A5F"/>
         </w:rPr>
-        <w:lastRenderedPageBreak/>
         <w:t xml:space="preserve">2.1 </w:t>
       </w:r>
       <w:r>
@@ -6313,32 +6388,92 @@
         <w:ind w:left="567"/>
         <w:rPr>
           <w:rFonts w:hint="eastAsia"/>
-        </w:rPr>
-      </w:pPr>
-      <w:r>
-        <w:rPr>
-          <w:rFonts w:ascii="Consolas" w:hAnsi="Consolas"/>
-          <w:color w:val="333333"/>
-          <w:sz w:val="19"/>
-        </w:rPr>
+          <w:lang w:eastAsia="zh-CN"/>
+        </w:rPr>
+      </w:pPr>
+      <w:proofErr w:type="spellStart"/>
+      <w:r>
+        <w:rPr>
+          <w:rFonts w:ascii="Consolas" w:hAnsi="Consolas"/>
+          <w:color w:val="333333"/>
+          <w:sz w:val="19"/>
+        </w:rPr>
+        <w:lastRenderedPageBreak/>
         <w:t>策略网络</w:t>
       </w:r>
-      <w:r>
-        <w:rPr>
-          <w:rFonts w:ascii="Consolas" w:hAnsi="Consolas"/>
-          <w:color w:val="333333"/>
-          <w:sz w:val="19"/>
-        </w:rPr>
-        <w:t xml:space="preserve"> pi_theta(a|s)</w:t>
-      </w:r>
-      <w:r>
-        <w:rPr>
-          <w:rFonts w:ascii="Consolas" w:hAnsi="Consolas"/>
-          <w:color w:val="333333"/>
-          <w:sz w:val="19"/>
-        </w:rPr>
-        <w:t>：输出动作的概率</w:t>
-      </w:r>
+      <w:proofErr w:type="spellEnd"/>
+      <w:r>
+        <w:rPr>
+          <w:rFonts w:ascii="Consolas" w:hAnsi="Consolas"/>
+          <w:color w:val="333333"/>
+          <w:sz w:val="19"/>
+        </w:rPr>
+        <w:t xml:space="preserve"> </w:t>
+      </w:r>
+      <w:proofErr w:type="spellStart"/>
+      <w:r>
+        <w:rPr>
+          <w:rFonts w:ascii="Consolas" w:hAnsi="Consolas"/>
+          <w:color w:val="333333"/>
+          <w:sz w:val="19"/>
+        </w:rPr>
+        <w:t>pi_theta</w:t>
+      </w:r>
+      <w:proofErr w:type="spellEnd"/>
+      <w:r>
+        <w:rPr>
+          <w:rFonts w:ascii="Consolas" w:hAnsi="Consolas"/>
+          <w:color w:val="333333"/>
+          <w:sz w:val="19"/>
+        </w:rPr>
+        <w:t>(</w:t>
+      </w:r>
+      <w:proofErr w:type="spellStart"/>
+      <w:r>
+        <w:rPr>
+          <w:rFonts w:ascii="Consolas" w:hAnsi="Consolas"/>
+          <w:color w:val="333333"/>
+          <w:sz w:val="19"/>
+        </w:rPr>
+        <w:t>a|</w:t>
+      </w:r>
+      <w:proofErr w:type="gramStart"/>
+      <w:r>
+        <w:rPr>
+          <w:rFonts w:ascii="Consolas" w:hAnsi="Consolas"/>
+          <w:color w:val="333333"/>
+          <w:sz w:val="19"/>
+        </w:rPr>
+        <w:t>s</w:t>
+      </w:r>
+      <w:proofErr w:type="spellEnd"/>
+      <w:r>
+        <w:rPr>
+          <w:rFonts w:ascii="Consolas" w:hAnsi="Consolas"/>
+          <w:color w:val="333333"/>
+          <w:sz w:val="19"/>
+        </w:rPr>
+        <w:t>)</w:t>
+      </w:r>
+      <w:r>
+        <w:rPr>
+          <w:rFonts w:ascii="Consolas" w:hAnsi="Consolas"/>
+          <w:color w:val="333333"/>
+          <w:sz w:val="19"/>
+        </w:rPr>
+        <w:t>：</w:t>
+      </w:r>
+      <w:proofErr w:type="spellStart"/>
+      <w:proofErr w:type="gramEnd"/>
+      <w:r>
+        <w:rPr>
+          <w:rFonts w:ascii="Consolas" w:hAnsi="Consolas"/>
+          <w:color w:val="333333"/>
+          <w:sz w:val="19"/>
+        </w:rPr>
+        <w:t>输出动作的概率</w:t>
+      </w:r>
+      <w:proofErr w:type="spellEnd"/>
     </w:p>
     <w:p>
       <w:pPr>
@@ -6348,6 +6483,86 @@
           <w:rFonts w:hint="eastAsia"/>
         </w:rPr>
       </w:pPr>
+      <w:proofErr w:type="spellStart"/>
+      <w:r>
+        <w:rPr>
+          <w:rFonts w:ascii="Consolas" w:hAnsi="Consolas"/>
+          <w:color w:val="333333"/>
+          <w:sz w:val="19"/>
+        </w:rPr>
+        <w:t>更新公式：</w:t>
+      </w:r>
+      <w:r>
+        <w:rPr>
+          <w:rFonts w:ascii="Consolas" w:hAnsi="Consolas"/>
+          <w:color w:val="333333"/>
+          <w:sz w:val="19"/>
+        </w:rPr>
+        <w:t>grad_J</w:t>
+      </w:r>
+      <w:proofErr w:type="spellEnd"/>
+      <w:r>
+        <w:rPr>
+          <w:rFonts w:ascii="Consolas" w:hAnsi="Consolas"/>
+          <w:color w:val="333333"/>
+          <w:sz w:val="19"/>
+        </w:rPr>
+        <w:t xml:space="preserve">(theta) = </w:t>
+      </w:r>
+      <w:proofErr w:type="gramStart"/>
+      <w:r>
+        <w:rPr>
+          <w:rFonts w:ascii="Consolas" w:hAnsi="Consolas"/>
+          <w:color w:val="333333"/>
+          <w:sz w:val="19"/>
+        </w:rPr>
+        <w:t>E[</w:t>
+      </w:r>
+      <w:proofErr w:type="gramEnd"/>
+      <w:r>
+        <w:rPr>
+          <w:rFonts w:ascii="Consolas" w:hAnsi="Consolas"/>
+          <w:color w:val="333333"/>
+          <w:sz w:val="19"/>
+        </w:rPr>
+        <w:t xml:space="preserve"> </w:t>
+      </w:r>
+      <w:proofErr w:type="spellStart"/>
+      <w:r>
+        <w:rPr>
+          <w:rFonts w:ascii="Consolas" w:hAnsi="Consolas"/>
+          <w:color w:val="333333"/>
+          <w:sz w:val="19"/>
+        </w:rPr>
+        <w:t>grad_log_pi_theta</w:t>
+      </w:r>
+      <w:proofErr w:type="spellEnd"/>
+      <w:r>
+        <w:rPr>
+          <w:rFonts w:ascii="Consolas" w:hAnsi="Consolas"/>
+          <w:color w:val="333333"/>
+          <w:sz w:val="19"/>
+        </w:rPr>
+        <w:t>(</w:t>
+      </w:r>
+      <w:proofErr w:type="spellStart"/>
+      <w:r>
+        <w:rPr>
+          <w:rFonts w:ascii="Consolas" w:hAnsi="Consolas"/>
+          <w:color w:val="333333"/>
+          <w:sz w:val="19"/>
+        </w:rPr>
+        <w:t>a|s</w:t>
+      </w:r>
+      <w:proofErr w:type="spellEnd"/>
+      <w:r>
+        <w:rPr>
+          <w:rFonts w:ascii="Consolas" w:hAnsi="Consolas"/>
+          <w:color w:val="333333"/>
+          <w:sz w:val="19"/>
+        </w:rPr>
+        <w:t>) * G ]</w:t>
+      </w:r>
     </w:p>
     <w:p>
       <w:pPr>
@@ -6355,23 +6570,61 @@
         <w:ind w:left="567"/>
         <w:rPr>
           <w:rFonts w:hint="eastAsia"/>
-        </w:rPr>
-      </w:pPr>
-      <w:r>
-        <w:rPr>
-          <w:rFonts w:ascii="Consolas" w:hAnsi="Consolas"/>
-          <w:color w:val="333333"/>
-          <w:sz w:val="19"/>
-        </w:rPr>
-        <w:t>更新公式：</w:t>
-      </w:r>
-      <w:r>
-        <w:rPr>
-          <w:rFonts w:ascii="Consolas" w:hAnsi="Consolas"/>
-          <w:color w:val="333333"/>
-          <w:sz w:val="19"/>
-        </w:rPr>
-        <w:t>grad_J(theta) = E[ grad_log_pi_theta(a|s) * G ]</w:t>
+          <w:lang w:eastAsia="zh-CN"/>
+        </w:rPr>
+      </w:pPr>
+      <w:r>
+        <w:rPr>
+          <w:rFonts w:ascii="Consolas" w:hAnsi="Consolas"/>
+          <w:color w:val="333333"/>
+          <w:sz w:val="19"/>
+        </w:rPr>
+        <w:t xml:space="preserve">            </w:t>
+      </w:r>
+      <w:r>
+        <w:rPr>
+          <w:rFonts w:ascii="Consolas" w:hAnsi="Consolas"/>
+          <w:color w:val="333333"/>
+          <w:sz w:val="19"/>
+          <w:lang w:eastAsia="zh-CN"/>
+        </w:rPr>
+        <w:t>提升方向</w:t>
+      </w:r>
+      <w:r>
+        <w:rPr>
+          <w:rFonts w:ascii="Consolas" w:hAnsi="Consolas"/>
+          <w:color w:val="333333"/>
+          <w:sz w:val="19"/>
+          <w:lang w:eastAsia="zh-CN"/>
+        </w:rPr>
+        <w:t xml:space="preserve">         </w:t>
+      </w:r>
+      <w:r>
+        <w:rPr>
+          <w:rFonts w:ascii="Consolas" w:hAnsi="Consolas"/>
+          <w:color w:val="333333"/>
+          <w:sz w:val="19"/>
+          <w:lang w:eastAsia="zh-CN"/>
+        </w:rPr>
+        <w:t>对动作概率求导</w:t>
+      </w:r>
+      <w:r>
+        <w:rPr>
+          <w:rFonts w:ascii="Consolas" w:hAnsi="Consolas"/>
+          <w:color w:val="333333"/>
+          <w:sz w:val="19"/>
+          <w:lang w:eastAsia="zh-CN"/>
+        </w:rPr>
+        <w:t xml:space="preserve">    </w:t>
+      </w:r>
+      <w:r>
+        <w:rPr>
+          <w:rFonts w:ascii="Consolas" w:hAnsi="Consolas"/>
+          <w:color w:val="333333"/>
+          <w:sz w:val="19"/>
+          <w:lang w:eastAsia="zh-CN"/>
+        </w:rPr>
+        <w:t>整条轨迹的累积奖励</w:t>
       </w:r>
     </w:p>
     <w:p>
@@ -6388,53 +6641,27 @@
           <w:rFonts w:ascii="Consolas" w:hAnsi="Consolas"/>
           <w:color w:val="333333"/>
           <w:sz w:val="19"/>
-        </w:rPr>
-        <w:t xml:space="preserve">            </w:t>
-      </w:r>
-      <w:r>
-        <w:rPr>
-          <w:rFonts w:ascii="Consolas" w:hAnsi="Consolas"/>
-          <w:color w:val="333333"/>
-          <w:sz w:val="19"/>
-          <w:lang w:eastAsia="zh-CN"/>
-        </w:rPr>
-        <w:t>提升方向</w:t>
-      </w:r>
-      <w:r>
-        <w:rPr>
-          <w:rFonts w:ascii="Consolas" w:hAnsi="Consolas"/>
-          <w:color w:val="333333"/>
-          <w:sz w:val="19"/>
-          <w:lang w:eastAsia="zh-CN"/>
-        </w:rPr>
-        <w:t xml:space="preserve">         </w:t>
-      </w:r>
-      <w:r>
-        <w:rPr>
-          <w:rFonts w:ascii="Consolas" w:hAnsi="Consolas"/>
-          <w:color w:val="333333"/>
-          <w:sz w:val="19"/>
-          <w:lang w:eastAsia="zh-CN"/>
-        </w:rPr>
-        <w:t>对动作概率求导</w:t>
-      </w:r>
-      <w:r>
-        <w:rPr>
-          <w:rFonts w:ascii="Consolas" w:hAnsi="Consolas"/>
-          <w:color w:val="333333"/>
-          <w:sz w:val="19"/>
-          <w:lang w:eastAsia="zh-CN"/>
-        </w:rPr>
-        <w:t xml:space="preserve">    </w:t>
-      </w:r>
-      <w:r>
-        <w:rPr>
-          <w:rFonts w:ascii="Consolas" w:hAnsi="Consolas"/>
-          <w:color w:val="333333"/>
-          <w:sz w:val="19"/>
-          <w:lang w:eastAsia="zh-CN"/>
-        </w:rPr>
-        <w:t>整条轨迹的累积奖励</w:t>
+          <w:lang w:eastAsia="zh-CN"/>
+        </w:rPr>
+        <w:t>直觉：如果整条轨迹拿到了高奖励</w:t>
+      </w:r>
+      <w:r>
+        <w:rPr>
+          <w:rFonts w:ascii="Consolas" w:hAnsi="Consolas"/>
+          <w:color w:val="333333"/>
+          <w:sz w:val="19"/>
+          <w:lang w:eastAsia="zh-CN"/>
+        </w:rPr>
+        <w:t xml:space="preserve"> G -&gt; </w:t>
+      </w:r>
+      <w:r>
+        <w:rPr>
+          <w:rFonts w:ascii="Consolas" w:hAnsi="Consolas"/>
+          <w:color w:val="333333"/>
+          <w:sz w:val="19"/>
+          <w:lang w:eastAsia="zh-CN"/>
+        </w:rPr>
+        <w:t>增大每个动作的概率</w:t>
       </w:r>
     </w:p>
     <w:p>
@@ -6446,6 +6673,321 @@
           <w:lang w:eastAsia="zh-CN"/>
         </w:rPr>
       </w:pPr>
+      <w:r>
+        <w:rPr>
+          <w:rFonts w:ascii="Consolas" w:hAnsi="Consolas"/>
+          <w:color w:val="333333"/>
+          <w:sz w:val="19"/>
+          <w:lang w:eastAsia="zh-CN"/>
+        </w:rPr>
+        <w:t xml:space="preserve">      </w:t>
+      </w:r>
+      <w:r>
+        <w:rPr>
+          <w:rFonts w:ascii="Consolas" w:hAnsi="Consolas"/>
+          <w:color w:val="333333"/>
+          <w:sz w:val="19"/>
+          <w:lang w:eastAsia="zh-CN"/>
+        </w:rPr>
+        <w:t>如果拿到了低奖励</w:t>
+      </w:r>
+      <w:r>
+        <w:rPr>
+          <w:rFonts w:ascii="Consolas" w:hAnsi="Consolas"/>
+          <w:color w:val="333333"/>
+          <w:sz w:val="19"/>
+          <w:lang w:eastAsia="zh-CN"/>
+        </w:rPr>
+        <w:t xml:space="preserve"> G    -&gt; </w:t>
+      </w:r>
+      <w:r>
+        <w:rPr>
+          <w:rFonts w:ascii="Consolas" w:hAnsi="Consolas"/>
+          <w:color w:val="333333"/>
+          <w:sz w:val="19"/>
+          <w:lang w:eastAsia="zh-CN"/>
+        </w:rPr>
+        <w:t>减小每个动作的概率</w:t>
+      </w:r>
+    </w:p>
+    <w:p>
+      <w:pPr>
+        <w:rPr>
+          <w:rFonts w:hint="eastAsia"/>
+        </w:rPr>
+      </w:pPr>
+      <w:r>
+        <w:rPr>
+          <w:b/>
+          <w:color w:val="C0392B"/>
+        </w:rPr>
+        <w:t xml:space="preserve">REINFORCE </w:t>
+      </w:r>
+      <w:proofErr w:type="spellStart"/>
+      <w:r>
+        <w:rPr>
+          <w:b/>
+          <w:color w:val="C0392B"/>
+        </w:rPr>
+        <w:t>的问题</w:t>
+      </w:r>
+      <w:proofErr w:type="spellEnd"/>
+      <w:r>
+        <w:rPr>
+          <w:b/>
+          <w:color w:val="C0392B"/>
+        </w:rPr>
+        <w:t>：</w:t>
+      </w:r>
+    </w:p>
+    <w:p>
+      <w:pPr>
+        <w:pStyle w:val="a0"/>
+        <w:ind w:left="850"/>
+        <w:rPr>
+          <w:rFonts w:hint="eastAsia"/>
+          <w:lang w:eastAsia="zh-CN"/>
+        </w:rPr>
+      </w:pPr>
+      <w:r>
+        <w:rPr>
+          <w:lang w:eastAsia="zh-CN"/>
+        </w:rPr>
+        <w:t>G 直到轨迹结束才能算出来 -&gt; 更新慢（需要整条轨迹跑完）</w:t>
+      </w:r>
+    </w:p>
+    <w:p>
+      <w:pPr>
+        <w:pStyle w:val="a0"/>
+        <w:ind w:left="850"/>
+        <w:rPr>
+          <w:rFonts w:hint="eastAsia"/>
+          <w:lang w:eastAsia="zh-CN"/>
+        </w:rPr>
+      </w:pPr>
+      <w:r>
+        <w:rPr>
+          <w:lang w:eastAsia="zh-CN"/>
+        </w:rPr>
+        <w:t>G 的</w:t>
+      </w:r>
+      <w:proofErr w:type="gramStart"/>
+      <w:r>
+        <w:rPr>
+          <w:lang w:eastAsia="zh-CN"/>
+        </w:rPr>
+        <w:t>方差极</w:t>
+      </w:r>
+      <w:proofErr w:type="gramEnd"/>
+      <w:r>
+        <w:rPr>
+          <w:lang w:eastAsia="zh-CN"/>
+        </w:rPr>
+        <w:t>大 -&gt; 训练不稳定</w:t>
+      </w:r>
+    </w:p>
+    <w:p>
+      <w:pPr>
+        <w:pStyle w:val="a0"/>
+        <w:ind w:left="850"/>
+        <w:rPr>
+          <w:rFonts w:hint="eastAsia"/>
+          <w:lang w:eastAsia="zh-CN"/>
+        </w:rPr>
+      </w:pPr>
+      <w:r>
+        <w:rPr>
+          <w:lang w:eastAsia="zh-CN"/>
+        </w:rPr>
+        <w:t>类比：看完整部电影</w:t>
+      </w:r>
+      <w:proofErr w:type="gramStart"/>
+      <w:r>
+        <w:rPr>
+          <w:lang w:eastAsia="zh-CN"/>
+        </w:rPr>
+        <w:t>才评价</w:t>
+      </w:r>
+      <w:proofErr w:type="gramEnd"/>
+      <w:r>
+        <w:rPr>
+          <w:lang w:eastAsia="zh-CN"/>
+        </w:rPr>
+        <w:t>演员"你第三分钟演得好不好"——说不清楚</w:t>
+      </w:r>
+    </w:p>
+    <w:p>
+      <w:pPr>
+        <w:pStyle w:val="31"/>
+      </w:pPr>
+      <w:proofErr w:type="spellStart"/>
+      <w:r>
+        <w:rPr>
+          <w:color w:val="1F3A5F"/>
+        </w:rPr>
+        <w:t>阶段</w:t>
+      </w:r>
+      <w:proofErr w:type="spellEnd"/>
+      <w:r>
+        <w:rPr>
+          <w:color w:val="1F3A5F"/>
+        </w:rPr>
+        <w:t xml:space="preserve"> 2</w:t>
+      </w:r>
+      <w:r>
+        <w:rPr>
+          <w:color w:val="1F3A5F"/>
+        </w:rPr>
+        <w:t>：</w:t>
+      </w:r>
+      <w:r>
+        <w:rPr>
+          <w:color w:val="1F3A5F"/>
+        </w:rPr>
+        <w:t>Actor-Critic</w:t>
+      </w:r>
+    </w:p>
+    <w:p>
+      <w:pPr>
+        <w:rPr>
+          <w:rFonts w:hint="eastAsia"/>
+          <w:lang w:eastAsia="zh-CN"/>
+        </w:rPr>
+      </w:pPr>
+      <w:r>
+        <w:t xml:space="preserve">改进思路：不等到轨迹结束，每步都做评估。引入 Critic </w:t>
+      </w:r>
+      <w:proofErr w:type="spellStart"/>
+      <w:r>
+        <w:t>网络</w:t>
+      </w:r>
+      <w:proofErr w:type="spellEnd"/>
+      <w:r>
+        <w:t>。</w:t>
+      </w:r>
+    </w:p>
+    <w:p>
+      <w:pPr>
+        <w:rPr>
+          <w:rFonts w:hint="eastAsia"/>
+        </w:rPr>
+      </w:pPr>
+      <w:proofErr w:type="spellStart"/>
+      <w:r>
+        <w:rPr>
+          <w:b/>
+        </w:rPr>
+        <w:t>Actor（演员</w:t>
+      </w:r>
+      <w:proofErr w:type="spellEnd"/>
+      <w:r>
+        <w:rPr>
+          <w:b/>
+        </w:rPr>
+        <w:t>）：</w:t>
+      </w:r>
+      <w:proofErr w:type="spellStart"/>
+      <w:r>
+        <w:rPr>
+          <w:b/>
+        </w:rPr>
+        <w:t>策略网络</w:t>
+      </w:r>
+      <w:proofErr w:type="spellEnd"/>
+      <w:r>
+        <w:rPr>
+          <w:b/>
+        </w:rPr>
+        <w:t xml:space="preserve"> </w:t>
+      </w:r>
+      <w:proofErr w:type="spellStart"/>
+      <w:r>
+        <w:rPr>
+          <w:b/>
+        </w:rPr>
+        <w:t>pi_theta</w:t>
+      </w:r>
+      <w:proofErr w:type="spellEnd"/>
+      <w:r>
+        <w:rPr>
+          <w:b/>
+        </w:rPr>
+        <w:t>(</w:t>
+      </w:r>
+      <w:proofErr w:type="spellStart"/>
+      <w:r>
+        <w:rPr>
+          <w:b/>
+        </w:rPr>
+        <w:t>a|s</w:t>
+      </w:r>
+      <w:proofErr w:type="spellEnd"/>
+      <w:r>
+        <w:rPr>
+          <w:b/>
+        </w:rPr>
+        <w:t xml:space="preserve">) -&gt; </w:t>
+      </w:r>
+      <w:proofErr w:type="spellStart"/>
+      <w:r>
+        <w:rPr>
+          <w:b/>
+        </w:rPr>
+        <w:t>决定怎么做</w:t>
+      </w:r>
+      <w:proofErr w:type="spellEnd"/>
+    </w:p>
+    <w:p>
+      <w:pPr>
+        <w:rPr>
+          <w:rFonts w:hint="eastAsia"/>
+          <w:lang w:eastAsia="zh-CN"/>
+        </w:rPr>
+      </w:pPr>
+      <w:r>
+        <w:rPr>
+          <w:b/>
+        </w:rPr>
+        <w:t xml:space="preserve">Critic（评委）：价值网络 V_phi(s) 或 </w:t>
+      </w:r>
+      <w:proofErr w:type="spellStart"/>
+      <w:r>
+        <w:rPr>
+          <w:b/>
+        </w:rPr>
+        <w:t>Q_phi</w:t>
+      </w:r>
+      <w:proofErr w:type="spellEnd"/>
+      <w:r>
+        <w:rPr>
+          <w:b/>
+        </w:rPr>
+        <w:t>(</w:t>
+      </w:r>
+      <w:proofErr w:type="spellStart"/>
+      <w:proofErr w:type="gramStart"/>
+      <w:r>
+        <w:rPr>
+          <w:b/>
+        </w:rPr>
+        <w:t>s,a</w:t>
+      </w:r>
+      <w:proofErr w:type="spellEnd"/>
+      <w:proofErr w:type="gramEnd"/>
+      <w:r>
+        <w:rPr>
+          <w:b/>
+        </w:rPr>
+        <w:t xml:space="preserve">) -&gt; </w:t>
+      </w:r>
+      <w:proofErr w:type="spellStart"/>
+      <w:r>
+        <w:rPr>
+          <w:b/>
+        </w:rPr>
+        <w:t>评价做得好不</w:t>
+      </w:r>
+      <w:proofErr w:type="spellEnd"/>
     </w:p>
     <w:p>
       <w:pPr>
@@ -6453,35 +6995,51 @@
         <w:ind w:left="567"/>
         <w:rPr>
           <w:rFonts w:hint="eastAsia"/>
-          <w:lang w:eastAsia="zh-CN"/>
-        </w:rPr>
-      </w:pPr>
-      <w:r>
-        <w:rPr>
-          <w:rFonts w:ascii="Consolas" w:hAnsi="Consolas"/>
-          <w:color w:val="333333"/>
-          <w:sz w:val="19"/>
-          <w:lang w:eastAsia="zh-CN"/>
-        </w:rPr>
-        <w:t>直觉：如果整条轨迹拿到了高奖励</w:t>
-      </w:r>
-      <w:r>
-        <w:rPr>
-          <w:rFonts w:ascii="Consolas" w:hAnsi="Consolas"/>
-          <w:color w:val="333333"/>
-          <w:sz w:val="19"/>
-          <w:lang w:eastAsia="zh-CN"/>
-        </w:rPr>
-        <w:t xml:space="preserve"> G -&gt; </w:t>
-      </w:r>
-      <w:r>
-        <w:rPr>
-          <w:rFonts w:ascii="Consolas" w:hAnsi="Consolas"/>
-          <w:color w:val="333333"/>
-          <w:sz w:val="19"/>
-          <w:lang w:eastAsia="zh-CN"/>
-        </w:rPr>
-        <w:t>增大每个动作的概率</w:t>
+        </w:rPr>
+      </w:pPr>
+      <w:r>
+        <w:rPr>
+          <w:rFonts w:ascii="Consolas" w:hAnsi="Consolas"/>
+          <w:color w:val="333333"/>
+          <w:sz w:val="19"/>
+        </w:rPr>
+        <w:t xml:space="preserve">Actor </w:t>
+      </w:r>
+      <w:proofErr w:type="spellStart"/>
+      <w:r>
+        <w:rPr>
+          <w:rFonts w:ascii="Consolas" w:hAnsi="Consolas"/>
+          <w:color w:val="333333"/>
+          <w:sz w:val="19"/>
+        </w:rPr>
+        <w:t>的更新（基于</w:t>
+      </w:r>
+      <w:proofErr w:type="spellEnd"/>
+      <w:r>
+        <w:rPr>
+          <w:rFonts w:ascii="Consolas" w:hAnsi="Consolas"/>
+          <w:color w:val="333333"/>
+          <w:sz w:val="19"/>
+        </w:rPr>
+        <w:t xml:space="preserve"> Critic </w:t>
+      </w:r>
+      <w:proofErr w:type="spellStart"/>
+      <w:r>
+        <w:rPr>
+          <w:rFonts w:ascii="Consolas" w:hAnsi="Consolas"/>
+          <w:color w:val="333333"/>
+          <w:sz w:val="19"/>
+        </w:rPr>
+        <w:t>的反馈</w:t>
+      </w:r>
+      <w:proofErr w:type="spellEnd"/>
+      <w:r>
+        <w:rPr>
+          <w:rFonts w:ascii="Consolas" w:hAnsi="Consolas"/>
+          <w:color w:val="333333"/>
+          <w:sz w:val="19"/>
+        </w:rPr>
+        <w:t>）：</w:t>
       </w:r>
     </w:p>
     <w:p>
@@ -6490,240 +7048,16 @@
         <w:ind w:left="567"/>
         <w:rPr>
           <w:rFonts w:hint="eastAsia"/>
-          <w:lang w:eastAsia="zh-CN"/>
-        </w:rPr>
-      </w:pPr>
-      <w:r>
-        <w:rPr>
-          <w:rFonts w:ascii="Consolas" w:hAnsi="Consolas"/>
-          <w:color w:val="333333"/>
-          <w:sz w:val="19"/>
-          <w:lang w:eastAsia="zh-CN"/>
-        </w:rPr>
-        <w:t xml:space="preserve">      </w:t>
-      </w:r>
-      <w:r>
-        <w:rPr>
-          <w:rFonts w:ascii="Consolas" w:hAnsi="Consolas"/>
-          <w:color w:val="333333"/>
-          <w:sz w:val="19"/>
-          <w:lang w:eastAsia="zh-CN"/>
-        </w:rPr>
-        <w:t>如果拿到了低奖励</w:t>
-      </w:r>
-      <w:r>
-        <w:rPr>
-          <w:rFonts w:ascii="Consolas" w:hAnsi="Consolas"/>
-          <w:color w:val="333333"/>
-          <w:sz w:val="19"/>
-          <w:lang w:eastAsia="zh-CN"/>
-        </w:rPr>
-        <w:t xml:space="preserve"> G    -&gt; </w:t>
-      </w:r>
-      <w:r>
-        <w:rPr>
-          <w:rFonts w:ascii="Consolas" w:hAnsi="Consolas"/>
-          <w:color w:val="333333"/>
-          <w:sz w:val="19"/>
-          <w:lang w:eastAsia="zh-CN"/>
-        </w:rPr>
-        <w:t>减小每个动作的概率</w:t>
-      </w:r>
-    </w:p>
-    <w:p>
-      <w:pPr>
-        <w:rPr>
-          <w:rFonts w:hint="eastAsia"/>
-          <w:lang w:eastAsia="zh-CN"/>
-        </w:rPr>
-      </w:pPr>
-    </w:p>
-    <w:p>
-      <w:pPr>
-        <w:rPr>
-          <w:rFonts w:hint="eastAsia"/>
-        </w:rPr>
-      </w:pPr>
-      <w:r>
-        <w:rPr>
-          <w:b/>
-          <w:color w:val="C0392B"/>
-        </w:rPr>
-        <w:t xml:space="preserve">REINFORCE </w:t>
-      </w:r>
-      <w:proofErr w:type="spellStart"/>
-      <w:r>
-        <w:rPr>
-          <w:b/>
-          <w:color w:val="C0392B"/>
-        </w:rPr>
-        <w:t>的问题</w:t>
-      </w:r>
-      <w:proofErr w:type="spellEnd"/>
-      <w:r>
-        <w:rPr>
-          <w:b/>
-          <w:color w:val="C0392B"/>
-        </w:rPr>
-        <w:t>：</w:t>
-      </w:r>
-    </w:p>
-    <w:p>
-      <w:pPr>
-        <w:pStyle w:val="a0"/>
-        <w:ind w:left="850"/>
-        <w:rPr>
-          <w:rFonts w:hint="eastAsia"/>
-          <w:lang w:eastAsia="zh-CN"/>
-        </w:rPr>
-      </w:pPr>
-      <w:r>
-        <w:rPr>
-          <w:lang w:eastAsia="zh-CN"/>
-        </w:rPr>
-        <w:t>G 直到轨迹结束才能算出来 -&gt; 更新慢（需要整条轨迹跑完）</w:t>
-      </w:r>
-    </w:p>
-    <w:p>
-      <w:pPr>
-        <w:pStyle w:val="a0"/>
-        <w:ind w:left="850"/>
-        <w:rPr>
-          <w:rFonts w:hint="eastAsia"/>
-          <w:lang w:eastAsia="zh-CN"/>
-        </w:rPr>
-      </w:pPr>
-      <w:r>
-        <w:rPr>
-          <w:lang w:eastAsia="zh-CN"/>
-        </w:rPr>
-        <w:t>G 的</w:t>
-      </w:r>
-      <w:proofErr w:type="gramStart"/>
-      <w:r>
-        <w:rPr>
-          <w:lang w:eastAsia="zh-CN"/>
-        </w:rPr>
-        <w:t>方差极</w:t>
-      </w:r>
-      <w:proofErr w:type="gramEnd"/>
-      <w:r>
-        <w:rPr>
-          <w:lang w:eastAsia="zh-CN"/>
-        </w:rPr>
-        <w:t>大 -&gt; 训练不稳定</w:t>
-      </w:r>
-    </w:p>
-    <w:p>
-      <w:pPr>
-        <w:pStyle w:val="a0"/>
-        <w:ind w:left="850"/>
-        <w:rPr>
-          <w:rFonts w:hint="eastAsia"/>
-          <w:lang w:eastAsia="zh-CN"/>
-        </w:rPr>
-      </w:pPr>
-      <w:r>
-        <w:rPr>
-          <w:lang w:eastAsia="zh-CN"/>
-        </w:rPr>
-        <w:t>类比：看完整部电影</w:t>
-      </w:r>
-      <w:proofErr w:type="gramStart"/>
-      <w:r>
-        <w:rPr>
-          <w:lang w:eastAsia="zh-CN"/>
-        </w:rPr>
-        <w:t>才评价</w:t>
-      </w:r>
-      <w:proofErr w:type="gramEnd"/>
-      <w:r>
-        <w:rPr>
-          <w:lang w:eastAsia="zh-CN"/>
-        </w:rPr>
-        <w:t>演员"你第三分钟演得好不好"——说不清楚</w:t>
-      </w:r>
-    </w:p>
-    <w:p>
-      <w:pPr>
-        <w:pStyle w:val="31"/>
-      </w:pPr>
-      <w:proofErr w:type="spellStart"/>
-      <w:r>
-        <w:rPr>
-          <w:color w:val="1F3A5F"/>
-        </w:rPr>
-        <w:t>阶段</w:t>
-      </w:r>
-      <w:proofErr w:type="spellEnd"/>
-      <w:r>
-        <w:rPr>
-          <w:color w:val="1F3A5F"/>
-        </w:rPr>
-        <w:t xml:space="preserve"> 2</w:t>
-      </w:r>
-      <w:r>
-        <w:rPr>
-          <w:color w:val="1F3A5F"/>
-        </w:rPr>
-        <w:t>：</w:t>
-      </w:r>
-      <w:r>
-        <w:rPr>
-          <w:color w:val="1F3A5F"/>
-        </w:rPr>
-        <w:t>Actor-Critic</w:t>
-      </w:r>
-    </w:p>
-    <w:p>
-      <w:pPr>
-        <w:rPr>
-          <w:rFonts w:hint="eastAsia"/>
-        </w:rPr>
-      </w:pPr>
-      <w:r>
-        <w:t>改进思路：不等到轨迹结束，每步都做评估。引入 Critic 网络。</w:t>
-      </w:r>
-    </w:p>
-    <w:p>
-      <w:pPr>
-        <w:rPr>
-          <w:rFonts w:hint="eastAsia"/>
-        </w:rPr>
-      </w:pPr>
-    </w:p>
-    <w:p>
-      <w:pPr>
-        <w:rPr>
-          <w:rFonts w:hint="eastAsia"/>
-        </w:rPr>
-      </w:pPr>
-      <w:r>
-        <w:rPr>
-          <w:b/>
-        </w:rPr>
-        <w:t>Actor（演员）：策略网络 pi_theta(a|s) -&gt; 决定怎么做</w:t>
-      </w:r>
-    </w:p>
-    <w:p>
-      <w:pPr>
-        <w:rPr>
-          <w:rFonts w:hint="eastAsia"/>
-        </w:rPr>
-      </w:pPr>
-      <w:r>
-        <w:rPr>
-          <w:b/>
-        </w:rPr>
-        <w:t>Critic（评委）：价值网络 V_phi(s) 或 Q_phi(s,a) -&gt; 评价做得好不好</w:t>
-      </w:r>
-    </w:p>
-    <w:p>
-      <w:pPr>
-        <w:rPr>
-          <w:rFonts w:hint="eastAsia"/>
-        </w:rPr>
-      </w:pPr>
+        </w:rPr>
+      </w:pPr>
+      <w:r>
+        <w:rPr>
+          <w:rFonts w:ascii="Consolas" w:hAnsi="Consolas"/>
+          <w:color w:val="333333"/>
+          <w:sz w:val="19"/>
+        </w:rPr>
+        <w:t xml:space="preserve">  grad_J(theta) = E[ grad_log_pi_theta(a|s) * Q_phi(s,a) ]</w:t>
+      </w:r>
     </w:p>
     <w:p>
       <w:pPr>
@@ -6731,23 +7065,24 @@
         <w:ind w:left="567"/>
         <w:rPr>
           <w:rFonts w:hint="eastAsia"/>
-        </w:rPr>
-      </w:pPr>
-      <w:r>
-        <w:rPr>
-          <w:rFonts w:ascii="Consolas" w:hAnsi="Consolas"/>
-          <w:color w:val="333333"/>
-          <w:sz w:val="19"/>
-        </w:rPr>
-        <w:t xml:space="preserve">Actor </w:t>
-      </w:r>
-      <w:r>
-        <w:rPr>
-          <w:rFonts w:ascii="Consolas" w:hAnsi="Consolas"/>
-          <w:color w:val="333333"/>
-          <w:sz w:val="19"/>
-        </w:rPr>
-        <w:t>的更新（基于</w:t>
+          <w:lang w:eastAsia="zh-CN"/>
+        </w:rPr>
+      </w:pPr>
+      <w:r>
+        <w:rPr>
+          <w:rFonts w:ascii="Consolas" w:hAnsi="Consolas"/>
+          <w:color w:val="333333"/>
+          <w:sz w:val="19"/>
+        </w:rPr>
+        <w:t xml:space="preserve">  </w:t>
+      </w:r>
+      <w:r>
+        <w:rPr>
+          <w:rFonts w:ascii="Consolas" w:hAnsi="Consolas"/>
+          <w:color w:val="333333"/>
+          <w:sz w:val="19"/>
+        </w:rPr>
+        <w:t>如果</w:t>
       </w:r>
       <w:r>
         <w:rPr>
@@ -6763,8 +7098,44 @@
           <w:color w:val="333333"/>
           <w:sz w:val="19"/>
         </w:rPr>
-        <w:t>的反馈）：</w:t>
-      </w:r>
+        <w:t>说</w:t>
+      </w:r>
+      <w:r>
+        <w:rPr>
+          <w:rFonts w:ascii="Consolas" w:hAnsi="Consolas"/>
+          <w:color w:val="333333"/>
+          <w:sz w:val="19"/>
+        </w:rPr>
+        <w:t xml:space="preserve"> Q </w:t>
+      </w:r>
+      <w:proofErr w:type="spellStart"/>
+      <w:r>
+        <w:rPr>
+          <w:rFonts w:ascii="Consolas" w:hAnsi="Consolas"/>
+          <w:color w:val="333333"/>
+          <w:sz w:val="19"/>
+        </w:rPr>
+        <w:t>值高</w:t>
+      </w:r>
+      <w:proofErr w:type="spellEnd"/>
+      <w:r>
+        <w:rPr>
+          <w:rFonts w:ascii="Consolas" w:hAnsi="Consolas"/>
+          <w:color w:val="333333"/>
+          <w:sz w:val="19"/>
+        </w:rPr>
+        <w:t xml:space="preserve"> -&gt; </w:t>
+      </w:r>
+      <w:proofErr w:type="spellStart"/>
+      <w:r>
+        <w:rPr>
+          <w:rFonts w:ascii="Consolas" w:hAnsi="Consolas"/>
+          <w:color w:val="333333"/>
+          <w:sz w:val="19"/>
+        </w:rPr>
+        <w:t>增大这个动作的概率</w:t>
+      </w:r>
+      <w:proofErr w:type="spellEnd"/>
     </w:p>
     <w:p>
       <w:pPr>
@@ -6780,7 +7151,25 @@
           <w:color w:val="333333"/>
           <w:sz w:val="19"/>
         </w:rPr>
-        <w:t xml:space="preserve">  grad_J(theta) = E[ grad_log_pi_theta(a|s) * Q_phi(s,a) ]</w:t>
+        <w:t xml:space="preserve">Critic </w:t>
+      </w:r>
+      <w:proofErr w:type="spellStart"/>
+      <w:r>
+        <w:rPr>
+          <w:rFonts w:ascii="Consolas" w:hAnsi="Consolas"/>
+          <w:color w:val="333333"/>
+          <w:sz w:val="19"/>
+        </w:rPr>
+        <w:t>的更新（基于实际奖励</w:t>
+      </w:r>
+      <w:proofErr w:type="spellEnd"/>
+      <w:r>
+        <w:rPr>
+          <w:rFonts w:ascii="Consolas" w:hAnsi="Consolas"/>
+          <w:color w:val="333333"/>
+          <w:sz w:val="19"/>
+        </w:rPr>
+        <w:t>）：</w:t>
       </w:r>
     </w:p>
     <w:p>
@@ -6797,64 +7186,7 @@
           <w:color w:val="333333"/>
           <w:sz w:val="19"/>
         </w:rPr>
-        <w:lastRenderedPageBreak/>
-        <w:t xml:space="preserve">  </w:t>
-      </w:r>
-      <w:r>
-        <w:rPr>
-          <w:rFonts w:ascii="Consolas" w:hAnsi="Consolas"/>
-          <w:color w:val="333333"/>
-          <w:sz w:val="19"/>
-        </w:rPr>
-        <w:t>如果</w:t>
-      </w:r>
-      <w:r>
-        <w:rPr>
-          <w:rFonts w:ascii="Consolas" w:hAnsi="Consolas"/>
-          <w:color w:val="333333"/>
-          <w:sz w:val="19"/>
-        </w:rPr>
-        <w:t xml:space="preserve"> Critic </w:t>
-      </w:r>
-      <w:r>
-        <w:rPr>
-          <w:rFonts w:ascii="Consolas" w:hAnsi="Consolas"/>
-          <w:color w:val="333333"/>
-          <w:sz w:val="19"/>
-        </w:rPr>
-        <w:t>说</w:t>
-      </w:r>
-      <w:r>
-        <w:rPr>
-          <w:rFonts w:ascii="Consolas" w:hAnsi="Consolas"/>
-          <w:color w:val="333333"/>
-          <w:sz w:val="19"/>
-        </w:rPr>
-        <w:t xml:space="preserve"> Q </w:t>
-      </w:r>
-      <w:r>
-        <w:rPr>
-          <w:rFonts w:ascii="Consolas" w:hAnsi="Consolas"/>
-          <w:color w:val="333333"/>
-          <w:sz w:val="19"/>
-        </w:rPr>
-        <w:t>值高</w:t>
-      </w:r>
-      <w:r>
-        <w:rPr>
-          <w:rFonts w:ascii="Consolas" w:hAnsi="Consolas"/>
-          <w:color w:val="333333"/>
-          <w:sz w:val="19"/>
-        </w:rPr>
-        <w:t xml:space="preserve"> -&gt; </w:t>
-      </w:r>
-      <w:r>
-        <w:rPr>
-          <w:rFonts w:ascii="Consolas" w:hAnsi="Consolas"/>
-          <w:color w:val="333333"/>
-          <w:sz w:val="19"/>
-        </w:rPr>
-        <w:t>增大这个动作的概率</w:t>
+        <w:t xml:space="preserve">  L(phi) = ( r + gamma * V_phi(sp) - V_phi(s) )^2</w:t>
       </w:r>
     </w:p>
     <w:p>
@@ -6863,8 +7195,116 @@
         <w:ind w:left="567"/>
         <w:rPr>
           <w:rFonts w:hint="eastAsia"/>
-        </w:rPr>
-      </w:pPr>
+          <w:lang w:eastAsia="zh-CN"/>
+        </w:rPr>
+      </w:pPr>
+      <w:r>
+        <w:rPr>
+          <w:rFonts w:ascii="Consolas" w:hAnsi="Consolas"/>
+          <w:color w:val="333333"/>
+          <w:sz w:val="19"/>
+        </w:rPr>
+        <w:t xml:space="preserve">  </w:t>
+      </w:r>
+      <w:r>
+        <w:rPr>
+          <w:rFonts w:ascii="Consolas" w:hAnsi="Consolas"/>
+          <w:color w:val="333333"/>
+          <w:sz w:val="19"/>
+          <w:lang w:eastAsia="zh-CN"/>
+        </w:rPr>
+        <w:t>让价值估计更接近实际观测到的回报</w:t>
+      </w:r>
+    </w:p>
+    <w:p>
+      <w:pPr>
+        <w:rPr>
+          <w:rFonts w:hint="eastAsia"/>
+          <w:lang w:eastAsia="zh-CN"/>
+        </w:rPr>
+      </w:pPr>
+    </w:p>
+    <w:p>
+      <w:pPr>
+        <w:rPr>
+          <w:rFonts w:hint="eastAsia"/>
+        </w:rPr>
+      </w:pPr>
+      <w:proofErr w:type="spellStart"/>
+      <w:r>
+        <w:rPr>
+          <w:b/>
+        </w:rPr>
+        <w:t>类比理解</w:t>
+      </w:r>
+      <w:proofErr w:type="spellEnd"/>
+      <w:r>
+        <w:rPr>
+          <w:b/>
+        </w:rPr>
+        <w:t>：</w:t>
+      </w:r>
+    </w:p>
+    <w:p>
+      <w:pPr>
+        <w:rPr>
+          <w:rFonts w:hint="eastAsia"/>
+        </w:rPr>
+      </w:pPr>
+      <w:r>
+        <w:t xml:space="preserve">  REINFORCE = 演员自己看完整部票房结果来琢磨哪演得好（方差大）</w:t>
+      </w:r>
+    </w:p>
+    <w:p>
+      <w:pPr>
+        <w:rPr>
+          <w:rFonts w:hint="eastAsia"/>
+        </w:rPr>
+      </w:pPr>
+      <w:r>
+        <w:t xml:space="preserve">  Actor-Critic = 演员演一幕，导演当场点评（方差小，更新快）</w:t>
+      </w:r>
+    </w:p>
+    <w:p>
+      <w:pPr>
+        <w:rPr>
+          <w:rFonts w:hint="eastAsia"/>
+        </w:rPr>
+      </w:pPr>
+      <w:r>
+        <w:br w:type="page"/>
+      </w:r>
+    </w:p>
+    <w:p>
+      <w:pPr>
+        <w:pStyle w:val="21"/>
+      </w:pPr>
+      <w:r>
+        <w:rPr>
+          <w:color w:val="1F3A5F"/>
+        </w:rPr>
+        <w:lastRenderedPageBreak/>
+        <w:t xml:space="preserve">2.2 SAC </w:t>
+      </w:r>
+      <w:r>
+        <w:rPr>
+          <w:color w:val="1F3A5F"/>
+        </w:rPr>
+        <w:t>的核心创新：最大熵框架</w:t>
+      </w:r>
+    </w:p>
+    <w:p>
+      <w:pPr>
+        <w:rPr>
+          <w:rFonts w:hint="eastAsia"/>
+        </w:rPr>
+      </w:pPr>
+      <w:r>
+        <w:rPr>
+          <w:b/>
+        </w:rPr>
+        <w:t>标准 RL 的目标</w:t>
+      </w:r>
     </w:p>
     <w:p>
       <w:pPr>
@@ -6880,15 +7320,20 @@
           <w:color w:val="333333"/>
           <w:sz w:val="19"/>
         </w:rPr>
-        <w:t xml:space="preserve">Critic </w:t>
-      </w:r>
-      <w:r>
-        <w:rPr>
-          <w:rFonts w:ascii="Consolas" w:hAnsi="Consolas"/>
-          <w:color w:val="333333"/>
-          <w:sz w:val="19"/>
-        </w:rPr>
-        <w:t>的更新（基于实际奖励）：</w:t>
+        <w:t>max E [ sum gamma^t * r(s_t, a_t) ]</w:t>
+      </w:r>
+    </w:p>
+    <w:p>
+      <w:pPr>
+        <w:rPr>
+          <w:rFonts w:hint="eastAsia"/>
+        </w:rPr>
+      </w:pPr>
+      <w:r>
+        <w:rPr>
+          <w:b/>
+        </w:rPr>
+        <w:t>最大熵 RL 的目标</w:t>
       </w:r>
     </w:p>
     <w:p>
@@ -6897,239 +7342,111 @@
         <w:ind w:left="567"/>
         <w:rPr>
           <w:rFonts w:hint="eastAsia"/>
-        </w:rPr>
-      </w:pPr>
-      <w:r>
-        <w:rPr>
-          <w:rFonts w:ascii="Consolas" w:hAnsi="Consolas"/>
-          <w:color w:val="333333"/>
-          <w:sz w:val="19"/>
-        </w:rPr>
-        <w:t xml:space="preserve">  L(phi) = ( r + gamma * V_phi(sp) - V_phi(s) )^2</w:t>
-      </w:r>
-    </w:p>
-    <w:p>
-      <w:pPr>
-        <w:spacing w:after="0"/>
-        <w:ind w:left="567"/>
-        <w:rPr>
-          <w:rFonts w:hint="eastAsia"/>
-          <w:lang w:eastAsia="zh-CN"/>
-        </w:rPr>
-      </w:pPr>
-      <w:r>
-        <w:rPr>
-          <w:rFonts w:ascii="Consolas" w:hAnsi="Consolas"/>
-          <w:color w:val="333333"/>
-          <w:sz w:val="19"/>
-        </w:rPr>
-        <w:t xml:space="preserve">  </w:t>
-      </w:r>
-      <w:r>
-        <w:rPr>
-          <w:rFonts w:ascii="Consolas" w:hAnsi="Consolas"/>
-          <w:color w:val="333333"/>
-          <w:sz w:val="19"/>
-          <w:lang w:eastAsia="zh-CN"/>
-        </w:rPr>
-        <w:t>让价值估计更接近实际观测到的回报</w:t>
-      </w:r>
-    </w:p>
-    <w:p>
-      <w:pPr>
-        <w:rPr>
-          <w:rFonts w:hint="eastAsia"/>
-          <w:lang w:eastAsia="zh-CN"/>
-        </w:rPr>
-      </w:pPr>
-    </w:p>
-    <w:p>
-      <w:pPr>
-        <w:rPr>
-          <w:rFonts w:hint="eastAsia"/>
+          <w:lang w:eastAsia="zh-CN"/>
+        </w:rPr>
+      </w:pPr>
+      <w:r>
+        <w:rPr>
+          <w:rFonts w:ascii="Consolas" w:hAnsi="Consolas"/>
+          <w:color w:val="333333"/>
+          <w:sz w:val="19"/>
+        </w:rPr>
+        <w:t xml:space="preserve">max E [ sum gamma^t * </w:t>
+      </w:r>
+      <w:proofErr w:type="gramStart"/>
+      <w:r>
+        <w:rPr>
+          <w:rFonts w:ascii="Consolas" w:hAnsi="Consolas"/>
+          <w:color w:val="333333"/>
+          <w:sz w:val="19"/>
+        </w:rPr>
+        <w:t>( r</w:t>
+      </w:r>
+      <w:proofErr w:type="gramEnd"/>
+      <w:r>
+        <w:rPr>
+          <w:rFonts w:ascii="Consolas" w:hAnsi="Consolas"/>
+          <w:color w:val="333333"/>
+          <w:sz w:val="19"/>
+        </w:rPr>
+        <w:t>(s_t, a_t) + alpha * H(pi(·|s_t)) ) ]</w:t>
+      </w:r>
+    </w:p>
+    <w:p>
+      <w:pPr>
+        <w:rPr>
+          <w:rFonts w:hint="eastAsia"/>
+          <w:lang w:eastAsia="zh-CN"/>
         </w:rPr>
       </w:pPr>
       <w:proofErr w:type="spellStart"/>
-      <w:r>
-        <w:rPr>
-          <w:b/>
-        </w:rPr>
-        <w:t>类比理解</w:t>
-      </w:r>
-      <w:proofErr w:type="spellEnd"/>
-      <w:r>
-        <w:rPr>
-          <w:b/>
-        </w:rPr>
-        <w:t>：</w:t>
-      </w:r>
-    </w:p>
-    <w:p>
-      <w:pPr>
-        <w:rPr>
-          <w:rFonts w:hint="eastAsia"/>
-        </w:rPr>
-      </w:pPr>
-      <w:r>
-        <w:t xml:space="preserve">  REINFORCE = 演员自己看完整部票房结果来琢磨哪演得好（方差大）</w:t>
-      </w:r>
-    </w:p>
-    <w:p>
-      <w:pPr>
-        <w:rPr>
-          <w:rFonts w:hint="eastAsia"/>
-        </w:rPr>
-      </w:pPr>
-      <w:r>
-        <w:t xml:space="preserve">  Actor-Critic = 演员演一幕，导演当场点评（方差小，更新快）</w:t>
-      </w:r>
-    </w:p>
-    <w:p>
-      <w:pPr>
-        <w:rPr>
-          <w:rFonts w:hint="eastAsia"/>
-        </w:rPr>
-      </w:pPr>
-      <w:r>
-        <w:br w:type="page"/>
-      </w:r>
-    </w:p>
-    <w:p>
-      <w:pPr>
-        <w:pStyle w:val="21"/>
-      </w:pPr>
-      <w:r>
-        <w:rPr>
-          <w:color w:val="1F3A5F"/>
-        </w:rPr>
-        <w:lastRenderedPageBreak/>
-        <w:t xml:space="preserve">2.2 SAC </w:t>
-      </w:r>
-      <w:r>
-        <w:rPr>
-          <w:color w:val="1F3A5F"/>
-        </w:rPr>
-        <w:t>的核心创新：最大熵框架</w:t>
-      </w:r>
-    </w:p>
-    <w:p>
-      <w:pPr>
-        <w:rPr>
-          <w:rFonts w:hint="eastAsia"/>
-        </w:rPr>
-      </w:pPr>
-      <w:r>
-        <w:rPr>
-          <w:b/>
-        </w:rPr>
-        <w:t>标准 RL 的目标</w:t>
-      </w:r>
-    </w:p>
-    <w:p>
-      <w:pPr>
-        <w:spacing w:after="0"/>
-        <w:ind w:left="567"/>
-        <w:rPr>
-          <w:rFonts w:hint="eastAsia"/>
-        </w:rPr>
-      </w:pPr>
-      <w:r>
-        <w:rPr>
-          <w:rFonts w:ascii="Consolas" w:hAnsi="Consolas"/>
-          <w:color w:val="333333"/>
-          <w:sz w:val="19"/>
-        </w:rPr>
-        <w:t>max E [ sum gamma^t * r(s_t, a_t) ]</w:t>
-      </w:r>
-    </w:p>
-    <w:p>
-      <w:pPr>
-        <w:rPr>
-          <w:rFonts w:hint="eastAsia"/>
-        </w:rPr>
-      </w:pPr>
-      <w:r>
-        <w:rPr>
-          <w:b/>
-        </w:rPr>
-        <w:t>最大熵 RL 的目标</w:t>
-      </w:r>
-    </w:p>
-    <w:p>
-      <w:pPr>
-        <w:spacing w:after="0"/>
-        <w:ind w:left="567"/>
-        <w:rPr>
-          <w:rFonts w:hint="eastAsia"/>
-        </w:rPr>
-      </w:pPr>
-      <w:r>
-        <w:rPr>
-          <w:rFonts w:ascii="Consolas" w:hAnsi="Consolas"/>
-          <w:color w:val="333333"/>
-          <w:sz w:val="19"/>
-        </w:rPr>
-        <w:t>max E [ sum gamma^t * ( r(s_t, a_t) + alpha * H(pi(·|s_t)) ) ]</w:t>
-      </w:r>
-    </w:p>
-    <w:p>
-      <w:pPr>
-        <w:rPr>
-          <w:rFonts w:hint="eastAsia"/>
-        </w:rPr>
-      </w:pPr>
-    </w:p>
-    <w:p>
-      <w:pPr>
-        <w:rPr>
-          <w:rFonts w:hint="eastAsia"/>
-        </w:rPr>
-      </w:pPr>
       <w:r>
         <w:rPr>
           <w:b/>
           <w:color w:val="1F3A5F"/>
           <w:sz w:val="24"/>
         </w:rPr>
-        <w:t>多出来的一项：alpha * H(pi(·|s_t))</w:t>
-      </w:r>
-    </w:p>
-    <w:p>
-      <w:pPr>
-        <w:rPr>
-          <w:rFonts w:hint="eastAsia"/>
-        </w:rPr>
-      </w:pPr>
-    </w:p>
-    <w:p>
-      <w:pPr>
-        <w:rPr>
-          <w:rFonts w:hint="eastAsia"/>
-        </w:rPr>
-      </w:pPr>
+        <w:t>多出来的一项：alpha</w:t>
+      </w:r>
+      <w:proofErr w:type="spellEnd"/>
       <w:r>
         <w:rPr>
           <w:b/>
-        </w:rPr>
-        <w:t>什么是熵（Entropy）？</w:t>
-      </w:r>
-    </w:p>
-    <w:p>
-      <w:pPr>
-        <w:rPr>
-          <w:rFonts w:hint="eastAsia"/>
+          <w:color w:val="1F3A5F"/>
+          <w:sz w:val="24"/>
+        </w:rPr>
+        <w:t xml:space="preserve"> * H(pi(·|</w:t>
+      </w:r>
+      <w:proofErr w:type="spellStart"/>
+      <w:r>
+        <w:rPr>
+          <w:b/>
+          <w:color w:val="1F3A5F"/>
+          <w:sz w:val="24"/>
+        </w:rPr>
+        <w:t>s_t</w:t>
+      </w:r>
+      <w:proofErr w:type="spellEnd"/>
+      <w:r>
+        <w:rPr>
+          <w:b/>
+          <w:color w:val="1F3A5F"/>
+          <w:sz w:val="24"/>
+        </w:rPr>
+        <w:t>))</w:t>
+      </w:r>
+    </w:p>
+    <w:p>
+      <w:pPr>
+        <w:rPr>
+          <w:rFonts w:hint="eastAsia"/>
+        </w:rPr>
+      </w:pPr>
+      <w:proofErr w:type="spellStart"/>
+      <w:r>
+        <w:rPr>
+          <w:b/>
+        </w:rPr>
+        <w:t>什么是熵（Entropy</w:t>
+      </w:r>
+      <w:proofErr w:type="spellEnd"/>
+      <w:r>
+        <w:rPr>
+          <w:b/>
+        </w:rPr>
+        <w:t>）？</w:t>
+      </w:r>
+    </w:p>
+    <w:p>
+      <w:pPr>
+        <w:rPr>
+          <w:rFonts w:hint="eastAsia"/>
+          <w:lang w:eastAsia="zh-CN"/>
         </w:rPr>
       </w:pPr>
       <w:r>
         <w:t>H(pi(·|s)) = -sum pi(a|s) * log pi(a|s)</w:t>
       </w:r>
-    </w:p>
-    <w:p>
-      <w:pPr>
-        <w:rPr>
-          <w:rFonts w:hint="eastAsia"/>
-        </w:rPr>
-      </w:pPr>
     </w:p>
     <w:p>
       <w:pPr>
@@ -7220,14 +7537,6 @@
           <w:lang w:eastAsia="zh-CN"/>
         </w:rPr>
       </w:pPr>
-    </w:p>
-    <w:p>
-      <w:pPr>
-        <w:rPr>
-          <w:rFonts w:hint="eastAsia"/>
-          <w:lang w:eastAsia="zh-CN"/>
-        </w:rPr>
-      </w:pPr>
       <w:r>
         <w:rPr>
           <w:b/>
@@ -7235,14 +7544,6 @@
         </w:rPr>
         <w:t>为什么加熵项？三个层面理解：</w:t>
       </w:r>
-    </w:p>
-    <w:p>
-      <w:pPr>
-        <w:rPr>
-          <w:rFonts w:hint="eastAsia"/>
-          <w:lang w:eastAsia="zh-CN"/>
-        </w:rPr>
-      </w:pPr>
     </w:p>
     <w:p>
       <w:pPr>
@@ -7290,7 +7591,6 @@
         <w:rPr>
           <w:lang w:eastAsia="zh-CN"/>
         </w:rPr>
-        <w:lastRenderedPageBreak/>
         <w:t>熵</w:t>
       </w:r>
       <w:proofErr w:type="gramEnd"/>
@@ -7335,14 +7635,6 @@
       <w:pPr>
         <w:rPr>
           <w:rFonts w:hint="eastAsia"/>
-          <w:lang w:eastAsia="zh-CN"/>
-        </w:rPr>
-      </w:pPr>
-    </w:p>
-    <w:p>
-      <w:pPr>
-        <w:rPr>
-          <w:rFonts w:hint="eastAsia"/>
         </w:rPr>
       </w:pPr>
       <w:proofErr w:type="spellStart"/>
@@ -7384,6 +7676,7 @@
         <w:rPr>
           <w:lang w:eastAsia="zh-CN"/>
         </w:rPr>
+        <w:lastRenderedPageBreak/>
         <w:t>类比：只会做一道菜的厨师，缺了关键材料就完了。会十道菜的厨师，换材料也能应变。</w:t>
       </w:r>
     </w:p>
@@ -7407,14 +7700,6 @@
       <w:pPr>
         <w:rPr>
           <w:rFonts w:hint="eastAsia"/>
-          <w:lang w:eastAsia="zh-CN"/>
-        </w:rPr>
-      </w:pPr>
-    </w:p>
-    <w:p>
-      <w:pPr>
-        <w:rPr>
-          <w:rFonts w:hint="eastAsia"/>
         </w:rPr>
       </w:pPr>
       <w:proofErr w:type="spellStart"/>
@@ -7461,27 +7746,12 @@
     </w:p>
     <w:p>
       <w:pPr>
-        <w:rPr>
-          <w:rFonts w:hint="eastAsia"/>
-          <w:lang w:eastAsia="zh-CN"/>
-        </w:rPr>
-      </w:pPr>
-      <w:r>
-        <w:rPr>
-          <w:lang w:eastAsia="zh-CN"/>
-        </w:rPr>
-        <w:br w:type="page"/>
-      </w:r>
-    </w:p>
-    <w:p>
-      <w:pPr>
         <w:pStyle w:val="21"/>
       </w:pPr>
       <w:r>
         <w:rPr>
           <w:color w:val="1F3A5F"/>
         </w:rPr>
-        <w:lastRenderedPageBreak/>
         <w:t xml:space="preserve">2.3 </w:t>
       </w:r>
       <w:proofErr w:type="spellStart"/>
@@ -7570,14 +7840,6 @@
           <w:lang w:eastAsia="zh-CN"/>
         </w:rPr>
       </w:pPr>
-    </w:p>
-    <w:p>
-      <w:pPr>
-        <w:rPr>
-          <w:rFonts w:hint="eastAsia"/>
-          <w:lang w:eastAsia="zh-CN"/>
-        </w:rPr>
-      </w:pPr>
       <w:r>
         <w:rPr>
           <w:b/>
@@ -7585,14 +7847,6 @@
         </w:rPr>
         <w:t>手动调 alpha 很麻烦——不同任务最优 alpha 不同。SAC 自动调 alpha：</w:t>
       </w:r>
-    </w:p>
-    <w:p>
-      <w:pPr>
-        <w:rPr>
-          <w:rFonts w:hint="eastAsia"/>
-          <w:lang w:eastAsia="zh-CN"/>
-        </w:rPr>
-      </w:pPr>
     </w:p>
     <w:p>
       <w:pPr>
@@ -7637,6 +7891,7 @@
         <w:ind w:left="567"/>
         <w:rPr>
           <w:rFonts w:hint="eastAsia"/>
+          <w:lang w:eastAsia="zh-CN"/>
         </w:rPr>
       </w:pPr>
       <w:proofErr w:type="spellStart"/>
@@ -7723,15 +7978,25 @@
           <w:color w:val="333333"/>
           <w:sz w:val="19"/>
         </w:rPr>
-        <w:t xml:space="preserve"> -&gt; H_target = -4</w:t>
-      </w:r>
-      <w:r>
-        <w:rPr>
-          <w:rFonts w:ascii="Consolas" w:hAnsi="Consolas"/>
-          <w:color w:val="333333"/>
-          <w:sz w:val="19"/>
-        </w:rPr>
-        <w:t>）</w:t>
+        <w:t xml:space="preserve"> -&gt; </w:t>
+      </w:r>
+      <w:proofErr w:type="spellStart"/>
+      <w:r>
+        <w:rPr>
+          <w:rFonts w:ascii="Consolas" w:hAnsi="Consolas"/>
+          <w:color w:val="333333"/>
+          <w:sz w:val="19"/>
+        </w:rPr>
+        <w:t>H_target</w:t>
+      </w:r>
+      <w:proofErr w:type="spellEnd"/>
+      <w:r>
+        <w:rPr>
+          <w:rFonts w:ascii="Consolas" w:hAnsi="Consolas"/>
+          <w:color w:val="333333"/>
+          <w:sz w:val="19"/>
+        </w:rPr>
+        <w:t xml:space="preserve"> = -4</w:t>
       </w:r>
     </w:p>
     <w:p>
@@ -7742,6 +8007,42 @@
           <w:rFonts w:hint="eastAsia"/>
         </w:rPr>
       </w:pPr>
+      <w:proofErr w:type="spellStart"/>
+      <w:r>
+        <w:rPr>
+          <w:rFonts w:ascii="Consolas" w:hAnsi="Consolas"/>
+          <w:color w:val="333333"/>
+          <w:sz w:val="19"/>
+        </w:rPr>
+        <w:t>loss_alpha</w:t>
+      </w:r>
+      <w:proofErr w:type="spellEnd"/>
+      <w:r>
+        <w:rPr>
+          <w:rFonts w:ascii="Consolas" w:hAnsi="Consolas"/>
+          <w:color w:val="333333"/>
+          <w:sz w:val="19"/>
+        </w:rPr>
+        <w:t xml:space="preserve"> = -alpha * </w:t>
+      </w:r>
+      <w:proofErr w:type="gramStart"/>
+      <w:r>
+        <w:rPr>
+          <w:rFonts w:ascii="Consolas" w:hAnsi="Consolas"/>
+          <w:color w:val="333333"/>
+          <w:sz w:val="19"/>
+        </w:rPr>
+        <w:t>( log</w:t>
+      </w:r>
+      <w:proofErr w:type="gramEnd"/>
+      <w:r>
+        <w:rPr>
+          <w:rFonts w:ascii="Consolas" w:hAnsi="Consolas"/>
+          <w:color w:val="333333"/>
+          <w:sz w:val="19"/>
+        </w:rPr>
+        <w:t>_pi_theta(a|s) + H_target )</w:t>
+      </w:r>
     </w:p>
     <w:p>
       <w:pPr>
@@ -7749,15 +8050,34 @@
         <w:ind w:left="567"/>
         <w:rPr>
           <w:rFonts w:hint="eastAsia"/>
-        </w:rPr>
-      </w:pPr>
-      <w:r>
-        <w:rPr>
-          <w:rFonts w:ascii="Consolas" w:hAnsi="Consolas"/>
-          <w:color w:val="333333"/>
-          <w:sz w:val="19"/>
-        </w:rPr>
-        <w:t>loss_alpha = -alpha * ( log_pi_theta(a|s) + H_target )</w:t>
+          <w:lang w:eastAsia="zh-CN"/>
+        </w:rPr>
+      </w:pPr>
+      <w:r>
+        <w:rPr>
+          <w:rFonts w:ascii="Consolas" w:hAnsi="Consolas"/>
+          <w:color w:val="333333"/>
+          <w:sz w:val="19"/>
+        </w:rPr>
+        <w:t xml:space="preserve">            &lt;- </w:t>
+      </w:r>
+      <w:proofErr w:type="spellStart"/>
+      <w:r>
+        <w:rPr>
+          <w:rFonts w:ascii="Consolas" w:hAnsi="Consolas"/>
+          <w:color w:val="333333"/>
+          <w:sz w:val="19"/>
+        </w:rPr>
+        <w:t>梯度下降更新</w:t>
+      </w:r>
+      <w:proofErr w:type="spellEnd"/>
+      <w:r>
+        <w:rPr>
+          <w:rFonts w:ascii="Consolas" w:hAnsi="Consolas"/>
+          <w:color w:val="333333"/>
+          <w:sz w:val="19"/>
+        </w:rPr>
+        <w:t xml:space="preserve"> alpha</w:t>
       </w:r>
     </w:p>
     <w:p>
@@ -7768,29 +8088,99 @@
           <w:rFonts w:hint="eastAsia"/>
         </w:rPr>
       </w:pPr>
-      <w:r>
-        <w:rPr>
-          <w:rFonts w:ascii="Consolas" w:hAnsi="Consolas"/>
-          <w:color w:val="333333"/>
-          <w:sz w:val="19"/>
-        </w:rPr>
-        <w:t xml:space="preserve">            &lt;- </w:t>
-      </w:r>
-      <w:r>
-        <w:rPr>
-          <w:rFonts w:ascii="Consolas" w:hAnsi="Consolas"/>
-          <w:color w:val="333333"/>
-          <w:sz w:val="19"/>
-        </w:rPr>
-        <w:t>梯度下降更新</w:t>
-      </w:r>
-      <w:r>
-        <w:rPr>
-          <w:rFonts w:ascii="Consolas" w:hAnsi="Consolas"/>
-          <w:color w:val="333333"/>
-          <w:sz w:val="19"/>
-        </w:rPr>
-        <w:t xml:space="preserve"> alpha</w:t>
+      <w:proofErr w:type="spellStart"/>
+      <w:r>
+        <w:rPr>
+          <w:rFonts w:ascii="Consolas" w:hAnsi="Consolas"/>
+          <w:color w:val="333333"/>
+          <w:sz w:val="19"/>
+        </w:rPr>
+        <w:t>当实际熵</w:t>
+      </w:r>
+      <w:proofErr w:type="spellEnd"/>
+      <w:r>
+        <w:rPr>
+          <w:rFonts w:ascii="Consolas" w:hAnsi="Consolas"/>
+          <w:color w:val="333333"/>
+          <w:sz w:val="19"/>
+        </w:rPr>
+        <w:t xml:space="preserve"> &lt; </w:t>
+      </w:r>
+      <w:proofErr w:type="spellStart"/>
+      <w:r>
+        <w:rPr>
+          <w:rFonts w:ascii="Consolas" w:hAnsi="Consolas"/>
+          <w:color w:val="333333"/>
+          <w:sz w:val="19"/>
+        </w:rPr>
+        <w:t>H_target</w:t>
+      </w:r>
+      <w:r>
+        <w:rPr>
+          <w:rFonts w:ascii="Consolas" w:hAnsi="Consolas"/>
+          <w:color w:val="333333"/>
+          <w:sz w:val="19"/>
+        </w:rPr>
+        <w:t>（策略太确定</w:t>
+      </w:r>
+      <w:proofErr w:type="spellEnd"/>
+      <w:r>
+        <w:rPr>
+          <w:rFonts w:ascii="Consolas" w:hAnsi="Consolas"/>
+          <w:color w:val="333333"/>
+          <w:sz w:val="19"/>
+        </w:rPr>
+        <w:t>）：</w:t>
+      </w:r>
+      <w:r>
+        <w:rPr>
+          <w:rFonts w:ascii="Consolas" w:hAnsi="Consolas"/>
+          <w:color w:val="333333"/>
+          <w:sz w:val="19"/>
+        </w:rPr>
+        <w:t xml:space="preserve">loss </w:t>
+      </w:r>
+      <w:proofErr w:type="spellStart"/>
+      <w:r>
+        <w:rPr>
+          <w:rFonts w:ascii="Consolas" w:hAnsi="Consolas"/>
+          <w:color w:val="333333"/>
+          <w:sz w:val="19"/>
+        </w:rPr>
+        <w:t>增大</w:t>
+      </w:r>
+      <w:proofErr w:type="spellEnd"/>
+      <w:r>
+        <w:rPr>
+          <w:rFonts w:ascii="Consolas" w:hAnsi="Consolas"/>
+          <w:color w:val="333333"/>
+          <w:sz w:val="19"/>
+        </w:rPr>
+        <w:t xml:space="preserve"> -&gt; alpha </w:t>
+      </w:r>
+      <w:r>
+        <w:rPr>
+          <w:rFonts w:ascii="Consolas" w:hAnsi="Consolas"/>
+          <w:color w:val="333333"/>
+          <w:sz w:val="19"/>
+        </w:rPr>
+        <w:t>增大</w:t>
+      </w:r>
+      <w:r>
+        <w:rPr>
+          <w:rFonts w:ascii="Consolas" w:hAnsi="Consolas"/>
+          <w:color w:val="333333"/>
+          <w:sz w:val="19"/>
+        </w:rPr>
+        <w:t xml:space="preserve"> -&gt; </w:t>
+      </w:r>
+      <w:r>
+        <w:rPr>
+          <w:rFonts w:ascii="Consolas" w:hAnsi="Consolas"/>
+          <w:color w:val="333333"/>
+          <w:sz w:val="19"/>
+        </w:rPr>
+        <w:t>鼓励探索</w:t>
       </w:r>
     </w:p>
     <w:p>
@@ -7799,15 +8189,7 @@
         <w:ind w:left="567"/>
         <w:rPr>
           <w:rFonts w:hint="eastAsia"/>
-        </w:rPr>
-      </w:pPr>
-    </w:p>
-    <w:p>
-      <w:pPr>
-        <w:spacing w:after="0"/>
-        <w:ind w:left="567"/>
-        <w:rPr>
-          <w:rFonts w:hint="eastAsia"/>
+          <w:lang w:eastAsia="zh-CN"/>
         </w:rPr>
       </w:pPr>
       <w:r>
@@ -7824,15 +8206,15 @@
           <w:color w:val="333333"/>
           <w:sz w:val="19"/>
         </w:rPr>
-        <w:t xml:space="preserve"> &lt; H_target</w:t>
-      </w:r>
-      <w:r>
-        <w:rPr>
-          <w:rFonts w:ascii="Consolas" w:hAnsi="Consolas"/>
-          <w:color w:val="333333"/>
-          <w:sz w:val="19"/>
-        </w:rPr>
-        <w:t>（策略太确定）：</w:t>
+        <w:t xml:space="preserve"> &gt; H_target</w:t>
+      </w:r>
+      <w:r>
+        <w:rPr>
+          <w:rFonts w:ascii="Consolas" w:hAnsi="Consolas"/>
+          <w:color w:val="333333"/>
+          <w:sz w:val="19"/>
+        </w:rPr>
+        <w:t>（策略太随机）：</w:t>
       </w:r>
       <w:r>
         <w:rPr>
@@ -7848,7 +8230,7 @@
           <w:color w:val="333333"/>
           <w:sz w:val="19"/>
         </w:rPr>
-        <w:t>增大</w:t>
+        <w:t>减小</w:t>
       </w:r>
       <w:r>
         <w:rPr>
@@ -7858,14 +8240,16 @@
         </w:rPr>
         <w:t xml:space="preserve"> -&gt; alpha </w:t>
       </w:r>
-      <w:r>
-        <w:rPr>
-          <w:rFonts w:ascii="Consolas" w:hAnsi="Consolas"/>
-          <w:color w:val="333333"/>
-          <w:sz w:val="19"/>
-        </w:rPr>
-        <w:t>增大</w:t>
-      </w:r>
+      <w:proofErr w:type="spellStart"/>
+      <w:r>
+        <w:rPr>
+          <w:rFonts w:ascii="Consolas" w:hAnsi="Consolas"/>
+          <w:color w:val="333333"/>
+          <w:sz w:val="19"/>
+        </w:rPr>
+        <w:t>减小</w:t>
+      </w:r>
+      <w:proofErr w:type="spellEnd"/>
       <w:r>
         <w:rPr>
           <w:rFonts w:ascii="Consolas" w:hAnsi="Consolas"/>
@@ -7874,87 +8258,7 @@
         </w:rPr>
         <w:t xml:space="preserve"> -&gt; </w:t>
       </w:r>
-      <w:r>
-        <w:rPr>
-          <w:rFonts w:ascii="Consolas" w:hAnsi="Consolas"/>
-          <w:color w:val="333333"/>
-          <w:sz w:val="19"/>
-        </w:rPr>
-        <w:t>鼓励探索</w:t>
-      </w:r>
-    </w:p>
-    <w:p>
-      <w:pPr>
-        <w:spacing w:after="0"/>
-        <w:ind w:left="567"/>
-        <w:rPr>
-          <w:rFonts w:hint="eastAsia"/>
-        </w:rPr>
-      </w:pPr>
-      <w:r>
-        <w:rPr>
-          <w:rFonts w:ascii="Consolas" w:hAnsi="Consolas"/>
-          <w:color w:val="333333"/>
-          <w:sz w:val="19"/>
-        </w:rPr>
-        <w:t>当实际熵</w:t>
-      </w:r>
-      <w:r>
-        <w:rPr>
-          <w:rFonts w:ascii="Consolas" w:hAnsi="Consolas"/>
-          <w:color w:val="333333"/>
-          <w:sz w:val="19"/>
-        </w:rPr>
-        <w:t xml:space="preserve"> &gt; H_target</w:t>
-      </w:r>
-      <w:r>
-        <w:rPr>
-          <w:rFonts w:ascii="Consolas" w:hAnsi="Consolas"/>
-          <w:color w:val="333333"/>
-          <w:sz w:val="19"/>
-        </w:rPr>
-        <w:t>（策略太随机）：</w:t>
-      </w:r>
-      <w:r>
-        <w:rPr>
-          <w:rFonts w:ascii="Consolas" w:hAnsi="Consolas"/>
-          <w:color w:val="333333"/>
-          <w:sz w:val="19"/>
-        </w:rPr>
-        <w:t xml:space="preserve">loss </w:t>
-      </w:r>
-      <w:r>
-        <w:rPr>
-          <w:rFonts w:ascii="Consolas" w:hAnsi="Consolas"/>
-          <w:color w:val="333333"/>
-          <w:sz w:val="19"/>
-        </w:rPr>
-        <w:t>减小</w:t>
-      </w:r>
-      <w:r>
-        <w:rPr>
-          <w:rFonts w:ascii="Consolas" w:hAnsi="Consolas"/>
-          <w:color w:val="333333"/>
-          <w:sz w:val="19"/>
-        </w:rPr>
-        <w:t xml:space="preserve"> -&gt; alpha </w:t>
-      </w:r>
-      <w:r>
-        <w:rPr>
-          <w:rFonts w:ascii="Consolas" w:hAnsi="Consolas"/>
-          <w:color w:val="333333"/>
-          <w:sz w:val="19"/>
-        </w:rPr>
-        <w:t>减小</w:t>
-      </w:r>
-      <w:r>
-        <w:rPr>
-          <w:rFonts w:ascii="Consolas" w:hAnsi="Consolas"/>
-          <w:color w:val="333333"/>
-          <w:sz w:val="19"/>
-        </w:rPr>
-        <w:t xml:space="preserve"> -&gt; </w:t>
-      </w:r>
+      <w:proofErr w:type="spellStart"/>
       <w:r>
         <w:rPr>
           <w:rFonts w:ascii="Consolas" w:hAnsi="Consolas"/>
@@ -7963,13 +8267,7 @@
         </w:rPr>
         <w:t>专注利用</w:t>
       </w:r>
-    </w:p>
-    <w:p>
-      <w:pPr>
-        <w:rPr>
-          <w:rFonts w:hint="eastAsia"/>
-        </w:rPr>
-      </w:pPr>
+      <w:proofErr w:type="spellEnd"/>
     </w:p>
     <w:p>
       <w:pPr>
@@ -7988,20 +8286,6 @@
     </w:p>
     <w:p>
       <w:pPr>
-        <w:rPr>
-          <w:rFonts w:hint="eastAsia"/>
-          <w:lang w:eastAsia="zh-CN"/>
-        </w:rPr>
-      </w:pPr>
-      <w:r>
-        <w:rPr>
-          <w:lang w:eastAsia="zh-CN"/>
-        </w:rPr>
-        <w:br w:type="page"/>
-      </w:r>
-    </w:p>
-    <w:p>
-      <w:pPr>
         <w:pStyle w:val="21"/>
         <w:rPr>
           <w:lang w:eastAsia="zh-CN"/>
@@ -8012,7 +8296,6 @@
           <w:color w:val="1F3A5F"/>
           <w:lang w:eastAsia="zh-CN"/>
         </w:rPr>
-        <w:lastRenderedPageBreak/>
         <w:t xml:space="preserve">2.4 SAC </w:t>
       </w:r>
       <w:r>
@@ -8235,9 +8518,10 @@
             </w:pPr>
             <w:r>
               <w:rPr>
+                <w:rFonts w:hint="eastAsia"/>
                 <w:sz w:val="20"/>
               </w:rPr>
-              <w:t>s</w:t>
+              <w:t>S</w:t>
             </w:r>
           </w:p>
         </w:tc>
@@ -8307,6 +8591,7 @@
               <w:rPr>
                 <w:sz w:val="20"/>
               </w:rPr>
+              <w:lastRenderedPageBreak/>
               <w:t>Critic Q1</w:t>
             </w:r>
           </w:p>
@@ -8746,20 +9031,6 @@
     </w:p>
     <w:p>
       <w:pPr>
-        <w:rPr>
-          <w:rFonts w:hint="eastAsia"/>
-          <w:lang w:eastAsia="zh-CN"/>
-        </w:rPr>
-      </w:pPr>
-      <w:r>
-        <w:rPr>
-          <w:lang w:eastAsia="zh-CN"/>
-        </w:rPr>
-        <w:br w:type="page"/>
-      </w:r>
-    </w:p>
-    <w:p>
-      <w:pPr>
         <w:pStyle w:val="21"/>
         <w:rPr>
           <w:lang w:eastAsia="zh-CN"/>
@@ -8770,7 +9041,6 @@
           <w:color w:val="1F3A5F"/>
           <w:lang w:eastAsia="zh-CN"/>
         </w:rPr>
-        <w:lastRenderedPageBreak/>
         <w:t xml:space="preserve">2.5 SAC </w:t>
       </w:r>
       <w:r>
@@ -9054,6 +9324,7 @@
           <w:color w:val="333333"/>
           <w:sz w:val="19"/>
         </w:rPr>
+        <w:lastRenderedPageBreak/>
         <w:t xml:space="preserve">    # ====== </w:t>
       </w:r>
       <w:r>
@@ -9514,7 +9785,6 @@
           <w:color w:val="333333"/>
           <w:sz w:val="19"/>
         </w:rPr>
-        <w:lastRenderedPageBreak/>
         <w:t xml:space="preserve">    Q_value = min(Q_theta1(s,a_new), Q_theta2(s,a_new))</w:t>
       </w:r>
     </w:p>
@@ -9842,18 +10112,44 @@
       <w:pPr>
         <w:rPr>
           <w:rFonts w:hint="eastAsia"/>
-        </w:rPr>
-      </w:pPr>
-      <w:r>
-        <w:t>Actor 输出的是"动作分布"（均值 mu 和标准差 sigma），但采样动作 a ~ N(mu, sigma) 这个操作不可导——梯度无法回传到 pi_phi。</w:t>
-      </w:r>
-    </w:p>
-    <w:p>
-      <w:pPr>
-        <w:rPr>
-          <w:rFonts w:hint="eastAsia"/>
-        </w:rPr>
-      </w:pPr>
+          <w:lang w:eastAsia="zh-CN"/>
+        </w:rPr>
+      </w:pPr>
+      <w:r>
+        <w:t xml:space="preserve">Actor 输出的是"动作分布"（均值 mu 和标准差 sigma），但采样动作 a ~ </w:t>
+      </w:r>
+      <w:proofErr w:type="gramStart"/>
+      <w:r>
+        <w:t>N(</w:t>
+      </w:r>
+      <w:proofErr w:type="gramEnd"/>
+      <w:r>
+        <w:t xml:space="preserve">mu, sigma) </w:t>
+      </w:r>
+      <w:proofErr w:type="spellStart"/>
+      <w:r>
+        <w:t>这个操作不可导</w:t>
+      </w:r>
+      <w:proofErr w:type="spellEnd"/>
+      <w:r>
+        <w:t>——</w:t>
+      </w:r>
+      <w:proofErr w:type="spellStart"/>
+      <w:r>
+        <w:t>梯度无法回传到</w:t>
+      </w:r>
+      <w:proofErr w:type="spellEnd"/>
+      <w:r>
+        <w:t xml:space="preserve"> </w:t>
+      </w:r>
+      <w:proofErr w:type="spellStart"/>
+      <w:r>
+        <w:t>pi_phi</w:t>
+      </w:r>
+      <w:proofErr w:type="spellEnd"/>
+      <w:r>
+        <w:t>。</w:t>
+      </w:r>
     </w:p>
     <w:p>
       <w:pPr>
@@ -9865,7 +10161,21 @@
         <w:rPr>
           <w:b/>
         </w:rPr>
-        <w:t>SAC 的解法：</w:t>
+        <w:t xml:space="preserve">SAC </w:t>
+      </w:r>
+      <w:proofErr w:type="spellStart"/>
+      <w:r>
+        <w:rPr>
+          <w:b/>
+        </w:rPr>
+        <w:t>的解法</w:t>
+      </w:r>
+      <w:proofErr w:type="spellEnd"/>
+      <w:r>
+        <w:rPr>
+          <w:b/>
+        </w:rPr>
+        <w:t>：</w:t>
       </w:r>
     </w:p>
     <w:p>
@@ -12945,31 +13255,31 @@
       </w:rPr>
     </w:lvl>
   </w:abstractNum>
-  <w:num w:numId="1" w16cid:durableId="374935226">
+  <w:num w:numId="1" w16cid:durableId="1333529243">
     <w:abstractNumId w:val="8"/>
   </w:num>
-  <w:num w:numId="2" w16cid:durableId="1655795083">
+  <w:num w:numId="2" w16cid:durableId="1932424740">
     <w:abstractNumId w:val="6"/>
   </w:num>
-  <w:num w:numId="3" w16cid:durableId="461075434">
+  <w:num w:numId="3" w16cid:durableId="624317495">
     <w:abstractNumId w:val="5"/>
   </w:num>
-  <w:num w:numId="4" w16cid:durableId="813446378">
+  <w:num w:numId="4" w16cid:durableId="355421771">
     <w:abstractNumId w:val="4"/>
   </w:num>
-  <w:num w:numId="5" w16cid:durableId="244188604">
+  <w:num w:numId="5" w16cid:durableId="707216915">
     <w:abstractNumId w:val="7"/>
   </w:num>
-  <w:num w:numId="6" w16cid:durableId="1041897801">
+  <w:num w:numId="6" w16cid:durableId="794445315">
     <w:abstractNumId w:val="3"/>
   </w:num>
-  <w:num w:numId="7" w16cid:durableId="289938629">
+  <w:num w:numId="7" w16cid:durableId="1369069550">
     <w:abstractNumId w:val="2"/>
   </w:num>
-  <w:num w:numId="8" w16cid:durableId="423501157">
+  <w:num w:numId="8" w16cid:durableId="1198393129">
     <w:abstractNumId w:val="1"/>
   </w:num>
-  <w:num w:numId="9" w16cid:durableId="557857729">
+  <w:num w:numId="9" w16cid:durableId="280496209">
     <w:abstractNumId w:val="0"/>
   </w:num>
 </w:numbering>

</xml_diff>

<commit_message>
doc: add dqn_explained line-by-line explain docx
</commit_message>
<xml_diff>
--- a/docs/notes/DQN_SAC_深度学习原理解析.docx
+++ b/docs/notes/DQN_SAC_深度学习原理解析.docx
@@ -13,27 +13,7 @@
       <w:pPr>
         <w:rPr>
           <w:rFonts w:hint="eastAsia"/>
-        </w:rPr>
-      </w:pPr>
-    </w:p>
-    <w:p>
-      <w:pPr>
-        <w:rPr>
-          <w:rFonts w:hint="eastAsia"/>
-        </w:rPr>
-      </w:pPr>
-    </w:p>
-    <w:p>
-      <w:pPr>
-        <w:rPr>
-          <w:rFonts w:hint="eastAsia"/>
-        </w:rPr>
-      </w:pPr>
-    </w:p>
-    <w:p>
-      <w:pPr>
-        <w:rPr>
-          <w:rFonts w:hint="eastAsia"/>
+          <w:lang w:eastAsia="zh-CN"/>
         </w:rPr>
       </w:pPr>
     </w:p>
@@ -1228,7 +1208,15 @@
       </w:r>
       <w:proofErr w:type="gramEnd"/>
       <w:r>
-        <w:t>s', a')：这是"实际观察到的奖励 + 对未来最优价值的估计"，比当前 Q(s,a) 更接近真实值，所以把它当目标</w:t>
+        <w:t>s', a')：</w:t>
+      </w:r>
+      <w:proofErr w:type="spellStart"/>
+      <w:r>
+        <w:t>这是"实际观察到的奖励</w:t>
+      </w:r>
+      <w:proofErr w:type="spellEnd"/>
+      <w:r>
+        <w:t xml:space="preserve"> + 对未来最优价值的估计"，比当前 Q(s,a) 更接近真实值，所以把它当目标</w:t>
       </w:r>
     </w:p>
     <w:p>
@@ -1358,7 +1346,31 @@
       </w:r>
       <w:proofErr w:type="spellEnd"/>
       <w:r>
-        <w:t xml:space="preserve"> Q_theta(s,a)，参数为 theta：</w:t>
+        <w:t xml:space="preserve"> </w:t>
+      </w:r>
+      <w:proofErr w:type="spellStart"/>
+      <w:r>
+        <w:t>Q_theta</w:t>
+      </w:r>
+      <w:proofErr w:type="spellEnd"/>
+      <w:r>
+        <w:t>(</w:t>
+      </w:r>
+      <w:proofErr w:type="spellStart"/>
+      <w:r>
+        <w:t>s,a</w:t>
+      </w:r>
+      <w:proofErr w:type="spellEnd"/>
+      <w:r>
+        <w:t>)，</w:t>
+      </w:r>
+      <w:proofErr w:type="spellStart"/>
+      <w:r>
+        <w:t>参数为</w:t>
+      </w:r>
+      <w:proofErr w:type="spellEnd"/>
+      <w:r>
+        <w:t xml:space="preserve"> theta：</w:t>
       </w:r>
     </w:p>
     <w:p>
@@ -4954,7 +4966,15 @@
       </w:r>
       <w:proofErr w:type="gramEnd"/>
       <w:r>
-        <w:t xml:space="preserve">s', a') 本身有估计误差，max </w:t>
+        <w:t xml:space="preserve">s', a') </w:t>
+      </w:r>
+      <w:proofErr w:type="spellStart"/>
+      <w:r>
+        <w:t>本身有估计误差，max</w:t>
+      </w:r>
+      <w:proofErr w:type="spellEnd"/>
+      <w:r>
+        <w:t xml:space="preserve"> </w:t>
       </w:r>
       <w:proofErr w:type="spellStart"/>
       <w:r>
@@ -6136,7 +6156,15 @@
         </w:rPr>
       </w:pPr>
       <w:r>
-        <w:t xml:space="preserve">DQN 的"先算 Q </w:t>
+        <w:t xml:space="preserve">DQN </w:t>
+      </w:r>
+      <w:proofErr w:type="spellStart"/>
+      <w:r>
+        <w:t>的"先算</w:t>
+      </w:r>
+      <w:proofErr w:type="spellEnd"/>
+      <w:r>
+        <w:t xml:space="preserve"> Q </w:t>
       </w:r>
       <w:proofErr w:type="spellStart"/>
       <w:r>
@@ -6267,7 +6295,21 @@
         <w:rPr>
           <w:b/>
         </w:rPr>
-        <w:t>) -&gt; 输出动作的概率分布：</w:t>
+        <w:t xml:space="preserve">) -&gt; </w:t>
+      </w:r>
+      <w:proofErr w:type="spellStart"/>
+      <w:r>
+        <w:rPr>
+          <w:b/>
+        </w:rPr>
+        <w:t>输出动作的概率分布</w:t>
+      </w:r>
+      <w:proofErr w:type="spellEnd"/>
+      <w:r>
+        <w:rPr>
+          <w:b/>
+        </w:rPr>
+        <w:t>：</w:t>
       </w:r>
     </w:p>
     <w:p>
@@ -6948,7 +6990,49 @@
         <w:rPr>
           <w:b/>
         </w:rPr>
-        <w:t xml:space="preserve">Critic（评委）：价值网络 V_phi(s) 或 </w:t>
+        <w:t>Critic（</w:t>
+      </w:r>
+      <w:proofErr w:type="spellStart"/>
+      <w:r>
+        <w:rPr>
+          <w:b/>
+        </w:rPr>
+        <w:t>评委</w:t>
+      </w:r>
+      <w:proofErr w:type="spellEnd"/>
+      <w:r>
+        <w:rPr>
+          <w:b/>
+        </w:rPr>
+        <w:t>）：</w:t>
+      </w:r>
+      <w:proofErr w:type="spellStart"/>
+      <w:r>
+        <w:rPr>
+          <w:b/>
+        </w:rPr>
+        <w:t>价值网络</w:t>
+      </w:r>
+      <w:proofErr w:type="spellEnd"/>
+      <w:r>
+        <w:rPr>
+          <w:b/>
+        </w:rPr>
+        <w:t xml:space="preserve"> </w:t>
+      </w:r>
+      <w:proofErr w:type="spellStart"/>
+      <w:r>
+        <w:rPr>
+          <w:b/>
+        </w:rPr>
+        <w:t>V_phi</w:t>
+      </w:r>
+      <w:proofErr w:type="spellEnd"/>
+      <w:r>
+        <w:rPr>
+          <w:b/>
+        </w:rPr>
+        <w:t xml:space="preserve">(s) 或 </w:t>
       </w:r>
       <w:proofErr w:type="spellStart"/>
       <w:r>
@@ -8224,6 +8308,7 @@
         </w:rPr>
         <w:t xml:space="preserve">loss </w:t>
       </w:r>
+      <w:proofErr w:type="spellStart"/>
       <w:r>
         <w:rPr>
           <w:rFonts w:ascii="Consolas" w:hAnsi="Consolas"/>
@@ -8232,6 +8317,7 @@
         </w:rPr>
         <w:t>减小</w:t>
       </w:r>
+      <w:proofErr w:type="spellEnd"/>
       <w:r>
         <w:rPr>
           <w:rFonts w:ascii="Consolas" w:hAnsi="Consolas"/>

</xml_diff>